<commit_message>
Fix homework4b final submission
</commit_message>
<xml_diff>
--- a/outputs/homework4b/202331060205_丁致宇_AI代码审查与修复表.docx
+++ b/outputs/homework4b/202331060205_丁致宇_AI代码审查与修复表.docx
@@ -708,7 +708,8 @@
             <w:r/>
             <w:r>
               <w:rPr>
-                <w:sz w:val="20"/>
+                <w:rFonts w:ascii="Microsoft YaHei" w:hAnsi="Microsoft YaHei"/>
+                <w:sz w:val="18"/>
               </w:rPr>
               <w:t>丁致宇</w:t>
             </w:r>
@@ -767,7 +768,8 @@
             <w:r/>
             <w:r>
               <w:rPr>
-                <w:sz w:val="20"/>
+                <w:rFonts w:ascii="Microsoft YaHei" w:hAnsi="Microsoft YaHei"/>
+                <w:sz w:val="18"/>
               </w:rPr>
               <w:t>202331060205</w:t>
             </w:r>
@@ -835,7 +837,8 @@
             <w:r/>
             <w:r>
               <w:rPr>
-                <w:sz w:val="20"/>
+                <w:rFonts w:ascii="Microsoft YaHei" w:hAnsi="Microsoft YaHei"/>
+                <w:sz w:val="18"/>
               </w:rPr>
               <w:t>作业4B：中频短线量化全流程（AI辅助版）</w:t>
             </w:r>
@@ -894,9 +897,10 @@
             <w:r/>
             <w:r>
               <w:rPr>
-                <w:sz w:val="20"/>
-              </w:rPr>
-              <w:t>☑ 日频短线 □ 周频中线 □ 混合周期</w:t>
+                <w:rFonts w:ascii="Microsoft YaHei" w:hAnsi="Microsoft YaHei"/>
+                <w:sz w:val="18"/>
+              </w:rPr>
+              <w:t>☑ 日频短线  □ 周频中线  □ 混合周期</w:t>
             </w:r>
           </w:p>
         </w:tc>
@@ -953,9 +957,10 @@
             <w:r/>
             <w:r>
               <w:rPr>
-                <w:sz w:val="20"/>
-              </w:rPr>
-              <w:t>□ 纯AI生成 ☑ AI生成+人工修改 □ 人工自主编写</w:t>
+                <w:rFonts w:ascii="Microsoft YaHei" w:hAnsi="Microsoft YaHei"/>
+                <w:sz w:val="18"/>
+              </w:rPr>
+              <w:t>□ 纯AI生成  ☑ AI生成+人工修改  □ 人工自主编写</w:t>
             </w:r>
           </w:p>
         </w:tc>
@@ -1021,7 +1026,8 @@
             <w:r/>
             <w:r>
               <w:rPr>
-                <w:sz w:val="20"/>
+                <w:rFonts w:ascii="Microsoft YaHei" w:hAnsi="Microsoft YaHei"/>
+                <w:sz w:val="18"/>
               </w:rPr>
               <w:t>约70%</w:t>
             </w:r>
@@ -1080,9 +1086,10 @@
             <w:r/>
             <w:r>
               <w:rPr>
-                <w:sz w:val="20"/>
-              </w:rPr>
-              <w:t>□ 纯快变量 ☑ 快变量为主+慢变量过滤 □ 快慢变量混合</w:t>
+                <w:rFonts w:ascii="Microsoft YaHei" w:hAnsi="Microsoft YaHei"/>
+                <w:sz w:val="18"/>
+              </w:rPr>
+              <w:t>□ 纯快变量  ☑ 快变量为主+慢变量过滤  □ 快慢变量混合</w:t>
             </w:r>
           </w:p>
         </w:tc>
@@ -1688,51 +1695,54 @@
             <w:r/>
             <w:r>
               <w:rPr>
-                <w:sz w:val="20"/>
-              </w:rPr>
-              <w:t>data.py:compute_factors, line 117</w:t>
-            </w:r>
-          </w:p>
-        </w:tc>
-        <w:tc>
-          <w:tcPr>
-            <w:tcW w:w="0" w:type="auto"/>
-            <w:tcMar>
-              <w:top w:w="75" w:type="dxa"/>
-              <w:left w:w="150" w:type="dxa"/>
-              <w:bottom w:w="75" w:type="dxa"/>
-              <w:right w:w="150" w:type="dxa"/>
-            </w:tcMar>
-            <w:vAlign w:val="center"/>
-            <w:hideMark/>
-          </w:tcPr>
-          <w:p>
-            <w:r/>
-            <w:r>
-              <w:rPr>
-                <w:sz w:val="20"/>
-              </w:rPr>
-              <w:t>Reversal因子使用当日ret（-当日收益率），属于当日信号当日收益。但回测中信号在收盘产生，次日执行交易，无未来函数。</w:t>
-            </w:r>
-          </w:p>
-        </w:tc>
-        <w:tc>
-          <w:tcPr>
-            <w:tcW w:w="0" w:type="auto"/>
-            <w:tcMar>
-              <w:top w:w="75" w:type="dxa"/>
-              <w:left w:w="150" w:type="dxa"/>
-              <w:bottom w:w="75" w:type="dxa"/>
-              <w:right w:w="150" w:type="dxa"/>
-            </w:tcMar>
-            <w:vAlign w:val="center"/>
-            <w:hideMark/>
-          </w:tcPr>
-          <w:p>
-            <w:r/>
-            <w:r>
-              <w:rPr>
-                <w:sz w:val="20"/>
+                <w:rFonts w:ascii="Microsoft YaHei" w:hAnsi="Microsoft YaHei"/>
+                <w:sz w:val="18"/>
+              </w:rPr>
+              <w:t>data.py:compute_factors</w:t>
+            </w:r>
+          </w:p>
+        </w:tc>
+        <w:tc>
+          <w:tcPr>
+            <w:tcW w:w="0" w:type="auto"/>
+            <w:tcMar>
+              <w:top w:w="75" w:type="dxa"/>
+              <w:left w:w="150" w:type="dxa"/>
+              <w:bottom w:w="75" w:type="dxa"/>
+              <w:right w:w="150" w:type="dxa"/>
+            </w:tcMar>
+            <w:vAlign w:val="center"/>
+            <w:hideMark/>
+          </w:tcPr>
+          <w:p>
+            <w:r/>
+            <w:r>
+              <w:rPr>
+                <w:rFonts w:ascii="Microsoft YaHei" w:hAnsi="Microsoft YaHei"/>
+                <w:sz w:val="18"/>
+              </w:rPr>
+              <w:t>因子使用T日收盘后已知数据，预测T+1日收益；未使用未来收益计算当日信号。</w:t>
+            </w:r>
+          </w:p>
+        </w:tc>
+        <w:tc>
+          <w:tcPr>
+            <w:tcW w:w="0" w:type="auto"/>
+            <w:tcMar>
+              <w:top w:w="75" w:type="dxa"/>
+              <w:left w:w="150" w:type="dxa"/>
+              <w:bottom w:w="75" w:type="dxa"/>
+              <w:right w:w="150" w:type="dxa"/>
+            </w:tcMar>
+            <w:vAlign w:val="center"/>
+            <w:hideMark/>
+          </w:tcPr>
+          <w:p>
+            <w:r/>
+            <w:r>
+              <w:rPr>
+                <w:rFonts w:ascii="Microsoft YaHei" w:hAnsi="Microsoft YaHei"/>
+                <w:sz w:val="18"/>
               </w:rPr>
               <w:t>无</w:t>
             </w:r>
@@ -1754,31 +1764,33 @@
             <w:r/>
             <w:r>
               <w:rPr>
-                <w:sz w:val="20"/>
-              </w:rPr>
-              <w:t>已修复</w:t>
-            </w:r>
-          </w:p>
-        </w:tc>
-        <w:tc>
-          <w:tcPr>
-            <w:tcW w:w="0" w:type="auto"/>
-            <w:tcMar>
-              <w:top w:w="75" w:type="dxa"/>
-              <w:left w:w="150" w:type="dxa"/>
-              <w:bottom w:w="75" w:type="dxa"/>
-              <w:right w:w="150" w:type="dxa"/>
-            </w:tcMar>
-            <w:vAlign w:val="center"/>
-            <w:hideMark/>
-          </w:tcPr>
-          <w:p>
-            <w:r/>
-            <w:r>
-              <w:rPr>
-                <w:sz w:val="20"/>
-              </w:rPr>
-              <w:t>Reversal因子定义为"-当日个股收益率"是作业要求，实际回测中信号在收盘产生，次日执行交易，时间上无未来函数。</w:t>
+                <w:rFonts w:ascii="Microsoft YaHei" w:hAnsi="Microsoft YaHei"/>
+                <w:sz w:val="18"/>
+              </w:rPr>
+              <w:t>合规</w:t>
+            </w:r>
+          </w:p>
+        </w:tc>
+        <w:tc>
+          <w:tcPr>
+            <w:tcW w:w="0" w:type="auto"/>
+            <w:tcMar>
+              <w:top w:w="75" w:type="dxa"/>
+              <w:left w:w="150" w:type="dxa"/>
+              <w:bottom w:w="75" w:type="dxa"/>
+              <w:right w:w="150" w:type="dxa"/>
+            </w:tcMar>
+            <w:vAlign w:val="center"/>
+            <w:hideMark/>
+          </w:tcPr>
+          <w:p>
+            <w:r/>
+            <w:r>
+              <w:rPr>
+                <w:rFonts w:ascii="Microsoft YaHei" w:hAnsi="Microsoft YaHei"/>
+                <w:sz w:val="18"/>
+              </w:rPr>
+              <w:t>Reversal=-ret，标签next_excess_ret仅用于训练/质检，不参与当日信号生成。</w:t>
             </w:r>
           </w:p>
         </w:tc>
@@ -1901,51 +1913,54 @@
             <w:r/>
             <w:r>
               <w:rPr>
-                <w:sz w:val="20"/>
-              </w:rPr>
-              <w:t>data.py:load_parquet_data, line 44</w:t>
-            </w:r>
-          </w:p>
-        </w:tc>
-        <w:tc>
-          <w:tcPr>
-            <w:tcW w:w="0" w:type="auto"/>
-            <w:tcMar>
-              <w:top w:w="75" w:type="dxa"/>
-              <w:left w:w="150" w:type="dxa"/>
-              <w:bottom w:w="75" w:type="dxa"/>
-              <w:right w:w="150" w:type="dxa"/>
-            </w:tcMar>
-            <w:vAlign w:val="center"/>
-            <w:hideMark/>
-          </w:tcPr>
-          <w:p>
-            <w:r/>
-            <w:r>
-              <w:rPr>
-                <w:sz w:val="20"/>
-              </w:rPr>
-              <w:t>所有数据加载后按trade_date排序，保证时间顺序</w:t>
-            </w:r>
-          </w:p>
-        </w:tc>
-        <w:tc>
-          <w:tcPr>
-            <w:tcW w:w="0" w:type="auto"/>
-            <w:tcMar>
-              <w:top w:w="75" w:type="dxa"/>
-              <w:left w:w="150" w:type="dxa"/>
-              <w:bottom w:w="75" w:type="dxa"/>
-              <w:right w:w="150" w:type="dxa"/>
-            </w:tcMar>
-            <w:vAlign w:val="center"/>
-            <w:hideMark/>
-          </w:tcPr>
-          <w:p>
-            <w:r/>
-            <w:r>
-              <w:rPr>
-                <w:sz w:val="20"/>
+                <w:rFonts w:ascii="Microsoft YaHei" w:hAnsi="Microsoft YaHei"/>
+                <w:sz w:val="18"/>
+              </w:rPr>
+              <w:t>data.py:load_parquet_data</w:t>
+            </w:r>
+          </w:p>
+        </w:tc>
+        <w:tc>
+          <w:tcPr>
+            <w:tcW w:w="0" w:type="auto"/>
+            <w:tcMar>
+              <w:top w:w="75" w:type="dxa"/>
+              <w:left w:w="150" w:type="dxa"/>
+              <w:bottom w:w="75" w:type="dxa"/>
+              <w:right w:w="150" w:type="dxa"/>
+            </w:tcMar>
+            <w:vAlign w:val="center"/>
+            <w:hideMark/>
+          </w:tcPr>
+          <w:p>
+            <w:r/>
+            <w:r>
+              <w:rPr>
+                <w:rFonts w:ascii="Microsoft YaHei" w:hAnsi="Microsoft YaHei"/>
+                <w:sz w:val="18"/>
+              </w:rPr>
+              <w:t>数据加载后按ts_code和trade_date排序，信号计算与回测按时间顺序执行。</w:t>
+            </w:r>
+          </w:p>
+        </w:tc>
+        <w:tc>
+          <w:tcPr>
+            <w:tcW w:w="0" w:type="auto"/>
+            <w:tcMar>
+              <w:top w:w="75" w:type="dxa"/>
+              <w:left w:w="150" w:type="dxa"/>
+              <w:bottom w:w="75" w:type="dxa"/>
+              <w:right w:w="150" w:type="dxa"/>
+            </w:tcMar>
+            <w:vAlign w:val="center"/>
+            <w:hideMark/>
+          </w:tcPr>
+          <w:p>
+            <w:r/>
+            <w:r>
+              <w:rPr>
+                <w:rFonts w:ascii="Microsoft YaHei" w:hAnsi="Microsoft YaHei"/>
+                <w:sz w:val="18"/>
               </w:rPr>
               <w:t>无</w:t>
             </w:r>
@@ -1967,7 +1982,8 @@
             <w:r/>
             <w:r>
               <w:rPr>
-                <w:sz w:val="20"/>
+                <w:rFonts w:ascii="Microsoft YaHei" w:hAnsi="Microsoft YaHei"/>
+                <w:sz w:val="18"/>
               </w:rPr>
               <w:t>合规</w:t>
             </w:r>
@@ -1989,9 +2005,10 @@
             <w:r/>
             <w:r>
               <w:rPr>
-                <w:sz w:val="20"/>
-              </w:rPr>
-              <w:t>df = df.sort_values(['ts_code', 'trade_date'])</w:t>
+                <w:rFonts w:ascii="Microsoft YaHei" w:hAnsi="Microsoft YaHei"/>
+                <w:sz w:val="18"/>
+              </w:rPr>
+              <w:t>df = df.sort_values(['ts_code', 'trade_date']).reset_index(drop=True)</w:t>
             </w:r>
           </w:p>
         </w:tc>
@@ -2101,51 +2118,54 @@
             <w:r/>
             <w:r>
               <w:rPr>
-                <w:sz w:val="20"/>
-              </w:rPr>
-              <w:t>backtest.py:run_backtest, line 84-139</w:t>
-            </w:r>
-          </w:p>
-        </w:tc>
-        <w:tc>
-          <w:tcPr>
-            <w:tcW w:w="0" w:type="auto"/>
-            <w:tcMar>
-              <w:top w:w="75" w:type="dxa"/>
-              <w:left w:w="150" w:type="dxa"/>
-              <w:bottom w:w="75" w:type="dxa"/>
-              <w:right w:w="150" w:type="dxa"/>
-            </w:tcMar>
-            <w:vAlign w:val="center"/>
-            <w:hideMark/>
-          </w:tcPr>
-          <w:p>
-            <w:r/>
-            <w:r>
-              <w:rPr>
-                <w:sz w:val="20"/>
-              </w:rPr>
-              <w:t>当日得分→收盘买入→次日卖出，信号与执行分离</w:t>
-            </w:r>
-          </w:p>
-        </w:tc>
-        <w:tc>
-          <w:tcPr>
-            <w:tcW w:w="0" w:type="auto"/>
-            <w:tcMar>
-              <w:top w:w="75" w:type="dxa"/>
-              <w:left w:w="150" w:type="dxa"/>
-              <w:bottom w:w="75" w:type="dxa"/>
-              <w:right w:w="150" w:type="dxa"/>
-            </w:tcMar>
-            <w:vAlign w:val="center"/>
-            <w:hideMark/>
-          </w:tcPr>
-          <w:p>
-            <w:r/>
-            <w:r>
-              <w:rPr>
-                <w:sz w:val="20"/>
+                <w:rFonts w:ascii="Microsoft YaHei" w:hAnsi="Microsoft YaHei"/>
+                <w:sz w:val="18"/>
+              </w:rPr>
+              <w:t>backtest.py:run_backtest</w:t>
+            </w:r>
+          </w:p>
+        </w:tc>
+        <w:tc>
+          <w:tcPr>
+            <w:tcW w:w="0" w:type="auto"/>
+            <w:tcMar>
+              <w:top w:w="75" w:type="dxa"/>
+              <w:left w:w="150" w:type="dxa"/>
+              <w:bottom w:w="75" w:type="dxa"/>
+              <w:right w:w="150" w:type="dxa"/>
+            </w:tcMar>
+            <w:vAlign w:val="center"/>
+            <w:hideMark/>
+          </w:tcPr>
+          <w:p>
+            <w:r/>
+            <w:r>
+              <w:rPr>
+                <w:rFonts w:ascii="Microsoft YaHei" w:hAnsi="Microsoft YaHei"/>
+                <w:sz w:val="18"/>
+              </w:rPr>
+              <w:t>需确认信号与收益结算时间错开，避免当日信号当日收益。</w:t>
+            </w:r>
+          </w:p>
+        </w:tc>
+        <w:tc>
+          <w:tcPr>
+            <w:tcW w:w="0" w:type="auto"/>
+            <w:tcMar>
+              <w:top w:w="75" w:type="dxa"/>
+              <w:left w:w="150" w:type="dxa"/>
+              <w:bottom w:w="75" w:type="dxa"/>
+              <w:right w:w="150" w:type="dxa"/>
+            </w:tcMar>
+            <w:vAlign w:val="center"/>
+            <w:hideMark/>
+          </w:tcPr>
+          <w:p>
+            <w:r/>
+            <w:r>
+              <w:rPr>
+                <w:rFonts w:ascii="Microsoft YaHei" w:hAnsi="Microsoft YaHei"/>
+                <w:sz w:val="18"/>
               </w:rPr>
               <w:t>无</w:t>
             </w:r>
@@ -2167,7 +2187,8 @@
             <w:r/>
             <w:r>
               <w:rPr>
-                <w:sz w:val="20"/>
+                <w:rFonts w:ascii="Microsoft YaHei" w:hAnsi="Microsoft YaHei"/>
+                <w:sz w:val="18"/>
               </w:rPr>
               <w:t>合规</w:t>
             </w:r>
@@ -2189,9 +2210,10 @@
             <w:r/>
             <w:r>
               <w:rPr>
-                <w:sz w:val="20"/>
-              </w:rPr>
-              <w:t>流程：打分→选股→T+1持有→T+2卖出</w:t>
+                <w:rFonts w:ascii="Microsoft YaHei" w:hAnsi="Microsoft YaHei"/>
+                <w:sz w:val="18"/>
+              </w:rPr>
+              <w:t>T日收盘后按LGBM得分选股调仓，T+1用持仓股票ret结算收益。</w:t>
             </w:r>
           </w:p>
         </w:tc>
@@ -2330,97 +2352,102 @@
             <w:r/>
             <w:r>
               <w:rPr>
-                <w:sz w:val="20"/>
-              </w:rPr>
-              <w:t>data.py:split_dataset, line 197-216</w:t>
-            </w:r>
-          </w:p>
-        </w:tc>
-        <w:tc>
-          <w:tcPr>
-            <w:tcW w:w="0" w:type="auto"/>
-            <w:tcMar>
-              <w:top w:w="75" w:type="dxa"/>
-              <w:left w:w="150" w:type="dxa"/>
-              <w:bottom w:w="75" w:type="dxa"/>
-              <w:right w:w="150" w:type="dxa"/>
-            </w:tcMar>
-            <w:vAlign w:val="center"/>
-            <w:hideMark/>
-          </w:tcPr>
-          <w:p>
-            <w:r/>
-            <w:r>
-              <w:rPr>
-                <w:sz w:val="20"/>
-              </w:rPr>
-              <w:t>训练集(2020-2023)和回测集(2024-2025)完全分离</w:t>
-            </w:r>
-          </w:p>
-        </w:tc>
-        <w:tc>
-          <w:tcPr>
-            <w:tcW w:w="0" w:type="auto"/>
-            <w:tcMar>
-              <w:top w:w="75" w:type="dxa"/>
-              <w:left w:w="150" w:type="dxa"/>
-              <w:bottom w:w="75" w:type="dxa"/>
-              <w:right w:w="150" w:type="dxa"/>
-            </w:tcMar>
-            <w:vAlign w:val="center"/>
-            <w:hideMark/>
-          </w:tcPr>
-          <w:p>
-            <w:r/>
-            <w:r>
-              <w:rPr>
-                <w:sz w:val="20"/>
-              </w:rPr>
-              <w:t>无</w:t>
-            </w:r>
-          </w:p>
-        </w:tc>
-        <w:tc>
-          <w:tcPr>
-            <w:tcW w:w="0" w:type="auto"/>
-            <w:tcMar>
-              <w:top w:w="75" w:type="dxa"/>
-              <w:left w:w="150" w:type="dxa"/>
-              <w:bottom w:w="75" w:type="dxa"/>
-              <w:right w:w="150" w:type="dxa"/>
-            </w:tcMar>
-            <w:vAlign w:val="center"/>
-            <w:hideMark/>
-          </w:tcPr>
-          <w:p>
-            <w:r/>
-            <w:r>
-              <w:rPr>
-                <w:sz w:val="20"/>
-              </w:rPr>
-              <w:t>合规</w:t>
-            </w:r>
-          </w:p>
-        </w:tc>
-        <w:tc>
-          <w:tcPr>
-            <w:tcW w:w="0" w:type="auto"/>
-            <w:tcMar>
-              <w:top w:w="75" w:type="dxa"/>
-              <w:left w:w="150" w:type="dxa"/>
-              <w:bottom w:w="75" w:type="dxa"/>
-              <w:right w:w="150" w:type="dxa"/>
-            </w:tcMar>
-            <w:vAlign w:val="center"/>
-            <w:hideMark/>
-          </w:tcPr>
-          <w:p>
-            <w:r/>
-            <w:r>
-              <w:rPr>
-                <w:sz w:val="20"/>
-              </w:rPr>
-              <w:t>严格按时间切分，无交叉</w:t>
+                <w:rFonts w:ascii="Microsoft YaHei" w:hAnsi="Microsoft YaHei"/>
+                <w:sz w:val="18"/>
+              </w:rPr>
+              <w:t>main.py:run_factor_quality_check</w:t>
+            </w:r>
+          </w:p>
+        </w:tc>
+        <w:tc>
+          <w:tcPr>
+            <w:tcW w:w="0" w:type="auto"/>
+            <w:tcMar>
+              <w:top w:w="75" w:type="dxa"/>
+              <w:left w:w="150" w:type="dxa"/>
+              <w:bottom w:w="75" w:type="dxa"/>
+              <w:right w:w="150" w:type="dxa"/>
+            </w:tcMar>
+            <w:vAlign w:val="center"/>
+            <w:hideMark/>
+          </w:tcPr>
+          <w:p>
+            <w:r/>
+            <w:r>
+              <w:rPr>
+                <w:rFonts w:ascii="Microsoft YaHei" w:hAnsi="Microsoft YaHei"/>
+                <w:sz w:val="18"/>
+              </w:rPr>
+              <w:t>原AI初稿对full_df做因子质检，且3σ缩尾曾使用全样本阈值，存在样本外信息污染风险。</w:t>
+            </w:r>
+          </w:p>
+        </w:tc>
+        <w:tc>
+          <w:tcPr>
+            <w:tcW w:w="0" w:type="auto"/>
+            <w:tcMar>
+              <w:top w:w="75" w:type="dxa"/>
+              <w:left w:w="150" w:type="dxa"/>
+              <w:bottom w:w="75" w:type="dxa"/>
+              <w:right w:w="150" w:type="dxa"/>
+            </w:tcMar>
+            <w:vAlign w:val="center"/>
+            <w:hideMark/>
+          </w:tcPr>
+          <w:p>
+            <w:r/>
+            <w:r>
+              <w:rPr>
+                <w:rFonts w:ascii="Microsoft YaHei" w:hAnsi="Microsoft YaHei"/>
+                <w:sz w:val="18"/>
+              </w:rPr>
+              <w:t>P0</w:t>
+            </w:r>
+          </w:p>
+        </w:tc>
+        <w:tc>
+          <w:tcPr>
+            <w:tcW w:w="0" w:type="auto"/>
+            <w:tcMar>
+              <w:top w:w="75" w:type="dxa"/>
+              <w:left w:w="150" w:type="dxa"/>
+              <w:bottom w:w="75" w:type="dxa"/>
+              <w:right w:w="150" w:type="dxa"/>
+            </w:tcMar>
+            <w:vAlign w:val="center"/>
+            <w:hideMark/>
+          </w:tcPr>
+          <w:p>
+            <w:r/>
+            <w:r>
+              <w:rPr>
+                <w:rFonts w:ascii="Microsoft YaHei" w:hAnsi="Microsoft YaHei"/>
+                <w:sz w:val="18"/>
+              </w:rPr>
+              <w:t>已修复</w:t>
+            </w:r>
+          </w:p>
+        </w:tc>
+        <w:tc>
+          <w:tcPr>
+            <w:tcW w:w="0" w:type="auto"/>
+            <w:tcMar>
+              <w:top w:w="75" w:type="dxa"/>
+              <w:left w:w="150" w:type="dxa"/>
+              <w:bottom w:w="75" w:type="dxa"/>
+              <w:right w:w="150" w:type="dxa"/>
+            </w:tcMar>
+            <w:vAlign w:val="center"/>
+            <w:hideMark/>
+          </w:tcPr>
+          <w:p>
+            <w:r/>
+            <w:r>
+              <w:rPr>
+                <w:rFonts w:ascii="Microsoft YaHei" w:hAnsi="Microsoft YaHei"/>
+                <w:sz w:val="18"/>
+              </w:rPr>
+              <w:t>仅对2020-2023训练集计算IC/IR、VIF和OLS；3σ缩尾改为交易日截面处理，2024-2025只用于回测。</w:t>
             </w:r>
           </w:p>
         </w:tc>
@@ -2512,97 +2539,102 @@
             <w:r/>
             <w:r>
               <w:rPr>
-                <w:sz w:val="20"/>
-              </w:rPr>
-              <w:t>models.py:train_lgbm_with_cv, line 44-141</w:t>
-            </w:r>
-          </w:p>
-        </w:tc>
-        <w:tc>
-          <w:tcPr>
-            <w:tcW w:w="0" w:type="auto"/>
-            <w:tcMar>
-              <w:top w:w="75" w:type="dxa"/>
-              <w:left w:w="150" w:type="dxa"/>
-              <w:bottom w:w="75" w:type="dxa"/>
-              <w:right w:w="150" w:type="dxa"/>
-            </w:tcMar>
-            <w:vAlign w:val="center"/>
-            <w:hideMark/>
-          </w:tcPr>
-          <w:p>
-            <w:r/>
-            <w:r>
-              <w:rPr>
-                <w:sz w:val="20"/>
-              </w:rPr>
-              <w:t>使用时间序列交叉验证，避免未来数据泄露</w:t>
-            </w:r>
-          </w:p>
-        </w:tc>
-        <w:tc>
-          <w:tcPr>
-            <w:tcW w:w="0" w:type="auto"/>
-            <w:tcMar>
-              <w:top w:w="75" w:type="dxa"/>
-              <w:left w:w="150" w:type="dxa"/>
-              <w:bottom w:w="75" w:type="dxa"/>
-              <w:right w:w="150" w:type="dxa"/>
-            </w:tcMar>
-            <w:vAlign w:val="center"/>
-            <w:hideMark/>
-          </w:tcPr>
-          <w:p>
-            <w:r/>
-            <w:r>
-              <w:rPr>
-                <w:sz w:val="20"/>
-              </w:rPr>
-              <w:t>无</w:t>
-            </w:r>
-          </w:p>
-        </w:tc>
-        <w:tc>
-          <w:tcPr>
-            <w:tcW w:w="0" w:type="auto"/>
-            <w:tcMar>
-              <w:top w:w="75" w:type="dxa"/>
-              <w:left w:w="150" w:type="dxa"/>
-              <w:bottom w:w="75" w:type="dxa"/>
-              <w:right w:w="150" w:type="dxa"/>
-            </w:tcMar>
-            <w:vAlign w:val="center"/>
-            <w:hideMark/>
-          </w:tcPr>
-          <w:p>
-            <w:r/>
-            <w:r>
-              <w:rPr>
-                <w:sz w:val="20"/>
-              </w:rPr>
-              <w:t>合规</w:t>
-            </w:r>
-          </w:p>
-        </w:tc>
-        <w:tc>
-          <w:tcPr>
-            <w:tcW w:w="0" w:type="auto"/>
-            <w:tcMar>
-              <w:top w:w="75" w:type="dxa"/>
-              <w:left w:w="150" w:type="dxa"/>
-              <w:bottom w:w="75" w:type="dxa"/>
-              <w:right w:w="150" w:type="dxa"/>
-            </w:tcMar>
-            <w:vAlign w:val="center"/>
-            <w:hideMark/>
-          </w:tcPr>
-          <w:p>
-            <w:r/>
-            <w:r>
-              <w:rPr>
-                <w:sz w:val="20"/>
-              </w:rPr>
-              <w:t>5折时间序列CV，验证集在训练集之后</w:t>
+                <w:rFonts w:ascii="Microsoft YaHei" w:hAnsi="Microsoft YaHei"/>
+                <w:sz w:val="18"/>
+              </w:rPr>
+              <w:t>models.py:train_lgbm_with_cv</w:t>
+            </w:r>
+          </w:p>
+        </w:tc>
+        <w:tc>
+          <w:tcPr>
+            <w:tcW w:w="0" w:type="auto"/>
+            <w:tcMar>
+              <w:top w:w="75" w:type="dxa"/>
+              <w:left w:w="150" w:type="dxa"/>
+              <w:bottom w:w="75" w:type="dxa"/>
+              <w:right w:w="150" w:type="dxa"/>
+            </w:tcMar>
+            <w:vAlign w:val="center"/>
+            <w:hideMark/>
+          </w:tcPr>
+          <w:p>
+            <w:r/>
+            <w:r>
+              <w:rPr>
+                <w:rFonts w:ascii="Microsoft YaHei" w:hAnsi="Microsoft YaHei"/>
+                <w:sz w:val="18"/>
+              </w:rPr>
+              <w:t>原时间序列CV名义5折，但第一折无训练集被跳过，实际不足5个验证窗口。</w:t>
+            </w:r>
+          </w:p>
+        </w:tc>
+        <w:tc>
+          <w:tcPr>
+            <w:tcW w:w="0" w:type="auto"/>
+            <w:tcMar>
+              <w:top w:w="75" w:type="dxa"/>
+              <w:left w:w="150" w:type="dxa"/>
+              <w:bottom w:w="75" w:type="dxa"/>
+              <w:right w:w="150" w:type="dxa"/>
+            </w:tcMar>
+            <w:vAlign w:val="center"/>
+            <w:hideMark/>
+          </w:tcPr>
+          <w:p>
+            <w:r/>
+            <w:r>
+              <w:rPr>
+                <w:rFonts w:ascii="Microsoft YaHei" w:hAnsi="Microsoft YaHei"/>
+                <w:sz w:val="18"/>
+              </w:rPr>
+              <w:t>P1</w:t>
+            </w:r>
+          </w:p>
+        </w:tc>
+        <w:tc>
+          <w:tcPr>
+            <w:tcW w:w="0" w:type="auto"/>
+            <w:tcMar>
+              <w:top w:w="75" w:type="dxa"/>
+              <w:left w:w="150" w:type="dxa"/>
+              <w:bottom w:w="75" w:type="dxa"/>
+              <w:right w:w="150" w:type="dxa"/>
+            </w:tcMar>
+            <w:vAlign w:val="center"/>
+            <w:hideMark/>
+          </w:tcPr>
+          <w:p>
+            <w:r/>
+            <w:r>
+              <w:rPr>
+                <w:rFonts w:ascii="Microsoft YaHei" w:hAnsi="Microsoft YaHei"/>
+                <w:sz w:val="18"/>
+              </w:rPr>
+              <w:t>已修复</w:t>
+            </w:r>
+          </w:p>
+        </w:tc>
+        <w:tc>
+          <w:tcPr>
+            <w:tcW w:w="0" w:type="auto"/>
+            <w:tcMar>
+              <w:top w:w="75" w:type="dxa"/>
+              <w:left w:w="150" w:type="dxa"/>
+              <w:bottom w:w="75" w:type="dxa"/>
+              <w:right w:w="150" w:type="dxa"/>
+            </w:tcMar>
+            <w:vAlign w:val="center"/>
+            <w:hideMark/>
+          </w:tcPr>
+          <w:p>
+            <w:r/>
+            <w:r>
+              <w:rPr>
+                <w:rFonts w:ascii="Microsoft YaHei" w:hAnsi="Microsoft YaHei"/>
+                <w:sz w:val="18"/>
+              </w:rPr>
+              <w:t>改为6个时间块生成5个扩展窗口CV，最佳Fold 5，验证MSE=0.000410。</w:t>
             </w:r>
           </w:p>
         </w:tc>
@@ -3083,97 +3115,102 @@
             <w:r/>
             <w:r>
               <w:rPr>
-                <w:sz w:val="20"/>
-              </w:rPr>
-              <w:t>data.py:compute_factors, line 112-153</w:t>
-            </w:r>
-          </w:p>
-        </w:tc>
-        <w:tc>
-          <w:tcPr>
-            <w:tcW w:w="0" w:type="auto"/>
-            <w:tcMar>
-              <w:top w:w="75" w:type="dxa"/>
-              <w:left w:w="150" w:type="dxa"/>
-              <w:bottom w:w="75" w:type="dxa"/>
-              <w:right w:w="150" w:type="dxa"/>
-            </w:tcMar>
-            <w:vAlign w:val="center"/>
-            <w:hideMark/>
-          </w:tcPr>
-          <w:p>
-            <w:r/>
-            <w:r>
-              <w:rPr>
-                <w:sz w:val="20"/>
-              </w:rPr>
-              <w:t>4个标准因子均为日频快变量，匹配1~2日持仓</w:t>
-            </w:r>
-          </w:p>
-        </w:tc>
-        <w:tc>
-          <w:tcPr>
-            <w:tcW w:w="0" w:type="auto"/>
-            <w:tcMar>
-              <w:top w:w="75" w:type="dxa"/>
-              <w:left w:w="150" w:type="dxa"/>
-              <w:bottom w:w="75" w:type="dxa"/>
-              <w:right w:w="150" w:type="dxa"/>
-            </w:tcMar>
-            <w:vAlign w:val="center"/>
-            <w:hideMark/>
-          </w:tcPr>
-          <w:p>
-            <w:r/>
-            <w:r>
-              <w:rPr>
-                <w:sz w:val="20"/>
-              </w:rPr>
-              <w:t>无</w:t>
-            </w:r>
-          </w:p>
-        </w:tc>
-        <w:tc>
-          <w:tcPr>
-            <w:tcW w:w="0" w:type="auto"/>
-            <w:tcMar>
-              <w:top w:w="75" w:type="dxa"/>
-              <w:left w:w="150" w:type="dxa"/>
-              <w:bottom w:w="75" w:type="dxa"/>
-              <w:right w:w="150" w:type="dxa"/>
-            </w:tcMar>
-            <w:vAlign w:val="center"/>
-            <w:hideMark/>
-          </w:tcPr>
-          <w:p>
-            <w:r/>
-            <w:r>
-              <w:rPr>
-                <w:sz w:val="20"/>
-              </w:rPr>
-              <w:t>合规</w:t>
-            </w:r>
-          </w:p>
-        </w:tc>
-        <w:tc>
-          <w:tcPr>
-            <w:tcW w:w="0" w:type="auto"/>
-            <w:tcMar>
-              <w:top w:w="75" w:type="dxa"/>
-              <w:left w:w="150" w:type="dxa"/>
-              <w:bottom w:w="75" w:type="dxa"/>
-              <w:right w:w="150" w:type="dxa"/>
-            </w:tcMar>
-            <w:vAlign w:val="center"/>
-            <w:hideMark/>
-          </w:tcPr>
-          <w:p>
-            <w:r/>
-            <w:r>
-              <w:rPr>
-                <w:sz w:val="20"/>
-              </w:rPr>
-              <w:t>Reversal/Liquidity/MoneyFlow/Value均为日频</w:t>
+                <w:rFonts w:ascii="Microsoft YaHei" w:hAnsi="Microsoft YaHei"/>
+                <w:sz w:val="18"/>
+              </w:rPr>
+              <w:t>config.py:FACTOR_NAMES</w:t>
+            </w:r>
+          </w:p>
+        </w:tc>
+        <w:tc>
+          <w:tcPr>
+            <w:tcW w:w="0" w:type="auto"/>
+            <w:tcMar>
+              <w:top w:w="75" w:type="dxa"/>
+              <w:left w:w="150" w:type="dxa"/>
+              <w:bottom w:w="75" w:type="dxa"/>
+              <w:right w:w="150" w:type="dxa"/>
+            </w:tcMar>
+            <w:vAlign w:val="center"/>
+            <w:hideMark/>
+          </w:tcPr>
+          <w:p>
+            <w:r/>
+            <w:r>
+              <w:rPr>
+                <w:rFonts w:ascii="Microsoft YaHei" w:hAnsi="Microsoft YaHei"/>
+                <w:sz w:val="18"/>
+              </w:rPr>
+              <w:t>原AI初稿额外加入Momentum、Volatility、Turnover、VolumeChange，偏离题目4因子要求。</w:t>
+            </w:r>
+          </w:p>
+        </w:tc>
+        <w:tc>
+          <w:tcPr>
+            <w:tcW w:w="0" w:type="auto"/>
+            <w:tcMar>
+              <w:top w:w="75" w:type="dxa"/>
+              <w:left w:w="150" w:type="dxa"/>
+              <w:bottom w:w="75" w:type="dxa"/>
+              <w:right w:w="150" w:type="dxa"/>
+            </w:tcMar>
+            <w:vAlign w:val="center"/>
+            <w:hideMark/>
+          </w:tcPr>
+          <w:p>
+            <w:r/>
+            <w:r>
+              <w:rPr>
+                <w:rFonts w:ascii="Microsoft YaHei" w:hAnsi="Microsoft YaHei"/>
+                <w:sz w:val="18"/>
+              </w:rPr>
+              <w:t>P1</w:t>
+            </w:r>
+          </w:p>
+        </w:tc>
+        <w:tc>
+          <w:tcPr>
+            <w:tcW w:w="0" w:type="auto"/>
+            <w:tcMar>
+              <w:top w:w="75" w:type="dxa"/>
+              <w:left w:w="150" w:type="dxa"/>
+              <w:bottom w:w="75" w:type="dxa"/>
+              <w:right w:w="150" w:type="dxa"/>
+            </w:tcMar>
+            <w:vAlign w:val="center"/>
+            <w:hideMark/>
+          </w:tcPr>
+          <w:p>
+            <w:r/>
+            <w:r>
+              <w:rPr>
+                <w:rFonts w:ascii="Microsoft YaHei" w:hAnsi="Microsoft YaHei"/>
+                <w:sz w:val="18"/>
+              </w:rPr>
+              <w:t>已修复</w:t>
+            </w:r>
+          </w:p>
+        </w:tc>
+        <w:tc>
+          <w:tcPr>
+            <w:tcW w:w="0" w:type="auto"/>
+            <w:tcMar>
+              <w:top w:w="75" w:type="dxa"/>
+              <w:left w:w="150" w:type="dxa"/>
+              <w:bottom w:w="75" w:type="dxa"/>
+              <w:right w:w="150" w:type="dxa"/>
+            </w:tcMar>
+            <w:vAlign w:val="center"/>
+            <w:hideMark/>
+          </w:tcPr>
+          <w:p>
+            <w:r/>
+            <w:r>
+              <w:rPr>
+                <w:rFonts w:ascii="Microsoft YaHei" w:hAnsi="Microsoft YaHei"/>
+                <w:sz w:val="18"/>
+              </w:rPr>
+              <w:t>最终只保留Reversal、Liquidity、MoneyFlow、Value四个标准因子。</w:t>
             </w:r>
           </w:p>
         </w:tc>
@@ -3304,51 +3341,54 @@
             <w:r/>
             <w:r>
               <w:rPr>
-                <w:sz w:val="20"/>
-              </w:rPr>
-              <w:t>data.py:compute_factors, line 132-134</w:t>
-            </w:r>
-          </w:p>
-        </w:tc>
-        <w:tc>
-          <w:tcPr>
-            <w:tcW w:w="0" w:type="auto"/>
-            <w:tcMar>
-              <w:top w:w="75" w:type="dxa"/>
-              <w:left w:w="150" w:type="dxa"/>
-              <w:bottom w:w="75" w:type="dxa"/>
-              <w:right w:w="150" w:type="dxa"/>
-            </w:tcMar>
-            <w:vAlign w:val="center"/>
-            <w:hideMark/>
-          </w:tcPr>
-          <w:p>
-            <w:r/>
-            <w:r>
-              <w:rPr>
-                <w:sz w:val="20"/>
-              </w:rPr>
-              <w:t>Value(PE_TTM倒数)为慢变量，仅作为选股辅助</w:t>
-            </w:r>
-          </w:p>
-        </w:tc>
-        <w:tc>
-          <w:tcPr>
-            <w:tcW w:w="0" w:type="auto"/>
-            <w:tcMar>
-              <w:top w:w="75" w:type="dxa"/>
-              <w:left w:w="150" w:type="dxa"/>
-              <w:bottom w:w="75" w:type="dxa"/>
-              <w:right w:w="150" w:type="dxa"/>
-            </w:tcMar>
-            <w:vAlign w:val="center"/>
-            <w:hideMark/>
-          </w:tcPr>
-          <w:p>
-            <w:r/>
-            <w:r>
-              <w:rPr>
-                <w:sz w:val="20"/>
+                <w:rFonts w:ascii="Microsoft YaHei" w:hAnsi="Microsoft YaHei"/>
+                <w:sz w:val="18"/>
+              </w:rPr>
+              <w:t>data.py:compute_factors</w:t>
+            </w:r>
+          </w:p>
+        </w:tc>
+        <w:tc>
+          <w:tcPr>
+            <w:tcW w:w="0" w:type="auto"/>
+            <w:tcMar>
+              <w:top w:w="75" w:type="dxa"/>
+              <w:left w:w="150" w:type="dxa"/>
+              <w:bottom w:w="75" w:type="dxa"/>
+              <w:right w:w="150" w:type="dxa"/>
+            </w:tcMar>
+            <w:vAlign w:val="center"/>
+            <w:hideMark/>
+          </w:tcPr>
+          <w:p>
+            <w:r/>
+            <w:r>
+              <w:rPr>
+                <w:rFonts w:ascii="Microsoft YaHei" w:hAnsi="Microsoft YaHei"/>
+                <w:sz w:val="18"/>
+              </w:rPr>
+              <w:t>Value为PE_TTM倒数，属于慢变量；在本作业中仅作为四因子之一参与截面排序辅助。</w:t>
+            </w:r>
+          </w:p>
+        </w:tc>
+        <w:tc>
+          <w:tcPr>
+            <w:tcW w:w="0" w:type="auto"/>
+            <w:tcMar>
+              <w:top w:w="75" w:type="dxa"/>
+              <w:left w:w="150" w:type="dxa"/>
+              <w:bottom w:w="75" w:type="dxa"/>
+              <w:right w:w="150" w:type="dxa"/>
+            </w:tcMar>
+            <w:vAlign w:val="center"/>
+            <w:hideMark/>
+          </w:tcPr>
+          <w:p>
+            <w:r/>
+            <w:r>
+              <w:rPr>
+                <w:rFonts w:ascii="Microsoft YaHei" w:hAnsi="Microsoft YaHei"/>
+                <w:sz w:val="18"/>
               </w:rPr>
               <w:t>无</w:t>
             </w:r>
@@ -3370,7 +3410,8 @@
             <w:r/>
             <w:r>
               <w:rPr>
-                <w:sz w:val="20"/>
+                <w:rFonts w:ascii="Microsoft YaHei" w:hAnsi="Microsoft YaHei"/>
+                <w:sz w:val="18"/>
               </w:rPr>
               <w:t>合规</w:t>
             </w:r>
@@ -3392,9 +3433,10 @@
             <w:r/>
             <w:r>
               <w:rPr>
-                <w:sz w:val="20"/>
-              </w:rPr>
-              <w:t>慢变量不作为短线主信号</w:t>
+                <w:rFonts w:ascii="Microsoft YaHei" w:hAnsi="Microsoft YaHei"/>
+                <w:sz w:val="18"/>
+              </w:rPr>
+              <w:t>Value=1/pe_ttm，低估值正向化；未使用未来财务数据。</w:t>
             </w:r>
           </w:p>
         </w:tc>
@@ -3506,97 +3548,102 @@
             <w:r/>
             <w:r>
               <w:rPr>
-                <w:sz w:val="20"/>
-              </w:rPr>
-              <w:t>data.py:clean_data, line 156-193</w:t>
-            </w:r>
-          </w:p>
-        </w:tc>
-        <w:tc>
-          <w:tcPr>
-            <w:tcW w:w="0" w:type="auto"/>
-            <w:tcMar>
-              <w:top w:w="75" w:type="dxa"/>
-              <w:left w:w="150" w:type="dxa"/>
-              <w:bottom w:w="75" w:type="dxa"/>
-              <w:right w:w="150" w:type="dxa"/>
-            </w:tcMar>
-            <w:vAlign w:val="center"/>
-            <w:hideMark/>
-          </w:tcPr>
-          <w:p>
-            <w:r/>
-            <w:r>
-              <w:rPr>
-                <w:sz w:val="20"/>
-              </w:rPr>
-              <w:t>使用3σ缩尾去极值，前值填充缺失值</w:t>
-            </w:r>
-          </w:p>
-        </w:tc>
-        <w:tc>
-          <w:tcPr>
-            <w:tcW w:w="0" w:type="auto"/>
-            <w:tcMar>
-              <w:top w:w="75" w:type="dxa"/>
-              <w:left w:w="150" w:type="dxa"/>
-              <w:bottom w:w="75" w:type="dxa"/>
-              <w:right w:w="150" w:type="dxa"/>
-            </w:tcMar>
-            <w:vAlign w:val="center"/>
-            <w:hideMark/>
-          </w:tcPr>
-          <w:p>
-            <w:r/>
-            <w:r>
-              <w:rPr>
-                <w:sz w:val="20"/>
-              </w:rPr>
-              <w:t>无</w:t>
-            </w:r>
-          </w:p>
-        </w:tc>
-        <w:tc>
-          <w:tcPr>
-            <w:tcW w:w="0" w:type="auto"/>
-            <w:tcMar>
-              <w:top w:w="75" w:type="dxa"/>
-              <w:left w:w="150" w:type="dxa"/>
-              <w:bottom w:w="75" w:type="dxa"/>
-              <w:right w:w="150" w:type="dxa"/>
-            </w:tcMar>
-            <w:vAlign w:val="center"/>
-            <w:hideMark/>
-          </w:tcPr>
-          <w:p>
-            <w:r/>
-            <w:r>
-              <w:rPr>
-                <w:sz w:val="20"/>
-              </w:rPr>
-              <w:t>合规</w:t>
-            </w:r>
-          </w:p>
-        </w:tc>
-        <w:tc>
-          <w:tcPr>
-            <w:tcW w:w="0" w:type="auto"/>
-            <w:tcMar>
-              <w:top w:w="75" w:type="dxa"/>
-              <w:left w:w="150" w:type="dxa"/>
-              <w:bottom w:w="75" w:type="dxa"/>
-              <w:right w:w="150" w:type="dxa"/>
-            </w:tcMar>
-            <w:vAlign w:val="center"/>
-            <w:hideMark/>
-          </w:tcPr>
-          <w:p>
-            <w:r/>
-            <w:r>
-              <w:rPr>
-                <w:sz w:val="20"/>
-              </w:rPr>
-              <w:t>df[col].clip(lower, upper)</w:t>
+                <w:rFonts w:ascii="Microsoft YaHei" w:hAnsi="Microsoft YaHei"/>
+                <w:sz w:val="18"/>
+              </w:rPr>
+              <w:t>data.py:clean_data</w:t>
+            </w:r>
+          </w:p>
+        </w:tc>
+        <w:tc>
+          <w:tcPr>
+            <w:tcW w:w="0" w:type="auto"/>
+            <w:tcMar>
+              <w:top w:w="75" w:type="dxa"/>
+              <w:left w:w="150" w:type="dxa"/>
+              <w:bottom w:w="75" w:type="dxa"/>
+              <w:right w:w="150" w:type="dxa"/>
+            </w:tcMar>
+            <w:vAlign w:val="center"/>
+            <w:hideMark/>
+          </w:tcPr>
+          <w:p>
+            <w:r/>
+            <w:r>
+              <w:rPr>
+                <w:rFonts w:ascii="Microsoft YaHei" w:hAnsi="Microsoft YaHei"/>
+                <w:sz w:val="18"/>
+              </w:rPr>
+              <w:t>原清洗阶段丢弃next_excess_ret为空的最后交易日，导致回测无法覆盖2025-12-31。</w:t>
+            </w:r>
+          </w:p>
+        </w:tc>
+        <w:tc>
+          <w:tcPr>
+            <w:tcW w:w="0" w:type="auto"/>
+            <w:tcMar>
+              <w:top w:w="75" w:type="dxa"/>
+              <w:left w:w="150" w:type="dxa"/>
+              <w:bottom w:w="75" w:type="dxa"/>
+              <w:right w:w="150" w:type="dxa"/>
+            </w:tcMar>
+            <w:vAlign w:val="center"/>
+            <w:hideMark/>
+          </w:tcPr>
+          <w:p>
+            <w:r/>
+            <w:r>
+              <w:rPr>
+                <w:rFonts w:ascii="Microsoft YaHei" w:hAnsi="Microsoft YaHei"/>
+                <w:sz w:val="18"/>
+              </w:rPr>
+              <w:t>P1</w:t>
+            </w:r>
+          </w:p>
+        </w:tc>
+        <w:tc>
+          <w:tcPr>
+            <w:tcW w:w="0" w:type="auto"/>
+            <w:tcMar>
+              <w:top w:w="75" w:type="dxa"/>
+              <w:left w:w="150" w:type="dxa"/>
+              <w:bottom w:w="75" w:type="dxa"/>
+              <w:right w:w="150" w:type="dxa"/>
+            </w:tcMar>
+            <w:vAlign w:val="center"/>
+            <w:hideMark/>
+          </w:tcPr>
+          <w:p>
+            <w:r/>
+            <w:r>
+              <w:rPr>
+                <w:rFonts w:ascii="Microsoft YaHei" w:hAnsi="Microsoft YaHei"/>
+                <w:sz w:val="18"/>
+              </w:rPr>
+              <w:t>已修复</w:t>
+            </w:r>
+          </w:p>
+        </w:tc>
+        <w:tc>
+          <w:tcPr>
+            <w:tcW w:w="0" w:type="auto"/>
+            <w:tcMar>
+              <w:top w:w="75" w:type="dxa"/>
+              <w:left w:w="150" w:type="dxa"/>
+              <w:bottom w:w="75" w:type="dxa"/>
+              <w:right w:w="150" w:type="dxa"/>
+            </w:tcMar>
+            <w:vAlign w:val="center"/>
+            <w:hideMark/>
+          </w:tcPr>
+          <w:p>
+            <w:r/>
+            <w:r>
+              <w:rPr>
+                <w:rFonts w:ascii="Microsoft YaHei" w:hAnsi="Microsoft YaHei"/>
+                <w:sz w:val="18"/>
+              </w:rPr>
+              <w:t>清洗只剔除ret为空记录；标签缺失只在建模和IC环节过滤。</w:t>
             </w:r>
           </w:p>
         </w:tc>
@@ -3724,51 +3771,54 @@
             <w:r/>
             <w:r>
               <w:rPr>
-                <w:sz w:val="20"/>
-              </w:rPr>
-              <w:t>factors.py:compute_vif, line 134-187</w:t>
-            </w:r>
-          </w:p>
-        </w:tc>
-        <w:tc>
-          <w:tcPr>
-            <w:tcW w:w="0" w:type="auto"/>
-            <w:tcMar>
-              <w:top w:w="75" w:type="dxa"/>
-              <w:left w:w="150" w:type="dxa"/>
-              <w:bottom w:w="75" w:type="dxa"/>
-              <w:right w:w="150" w:type="dxa"/>
-            </w:tcMar>
-            <w:vAlign w:val="center"/>
-            <w:hideMark/>
-          </w:tcPr>
-          <w:p>
-            <w:r/>
-            <w:r>
-              <w:rPr>
-                <w:sz w:val="20"/>
-              </w:rPr>
-              <w:t>所有因子VIF &lt; 2.3，远低于阈值5</w:t>
-            </w:r>
-          </w:p>
-        </w:tc>
-        <w:tc>
-          <w:tcPr>
-            <w:tcW w:w="0" w:type="auto"/>
-            <w:tcMar>
-              <w:top w:w="75" w:type="dxa"/>
-              <w:left w:w="150" w:type="dxa"/>
-              <w:bottom w:w="75" w:type="dxa"/>
-              <w:right w:w="150" w:type="dxa"/>
-            </w:tcMar>
-            <w:vAlign w:val="center"/>
-            <w:hideMark/>
-          </w:tcPr>
-          <w:p>
-            <w:r/>
-            <w:r>
-              <w:rPr>
-                <w:sz w:val="20"/>
+                <w:rFonts w:ascii="Microsoft YaHei" w:hAnsi="Microsoft YaHei"/>
+                <w:sz w:val="18"/>
+              </w:rPr>
+              <w:t>factors.py:compute_vif</w:t>
+            </w:r>
+          </w:p>
+        </w:tc>
+        <w:tc>
+          <w:tcPr>
+            <w:tcW w:w="0" w:type="auto"/>
+            <w:tcMar>
+              <w:top w:w="75" w:type="dxa"/>
+              <w:left w:w="150" w:type="dxa"/>
+              <w:bottom w:w="75" w:type="dxa"/>
+              <w:right w:w="150" w:type="dxa"/>
+            </w:tcMar>
+            <w:vAlign w:val="center"/>
+            <w:hideMark/>
+          </w:tcPr>
+          <w:p>
+            <w:r/>
+            <w:r>
+              <w:rPr>
+                <w:rFonts w:ascii="Microsoft YaHei" w:hAnsi="Microsoft YaHei"/>
+                <w:sz w:val="18"/>
+              </w:rPr>
+              <w:t>需验证四因子是否存在高共线。</w:t>
+            </w:r>
+          </w:p>
+        </w:tc>
+        <w:tc>
+          <w:tcPr>
+            <w:tcW w:w="0" w:type="auto"/>
+            <w:tcMar>
+              <w:top w:w="75" w:type="dxa"/>
+              <w:left w:w="150" w:type="dxa"/>
+              <w:bottom w:w="75" w:type="dxa"/>
+              <w:right w:w="150" w:type="dxa"/>
+            </w:tcMar>
+            <w:vAlign w:val="center"/>
+            <w:hideMark/>
+          </w:tcPr>
+          <w:p>
+            <w:r/>
+            <w:r>
+              <w:rPr>
+                <w:rFonts w:ascii="Microsoft YaHei" w:hAnsi="Microsoft YaHei"/>
+                <w:sz w:val="18"/>
               </w:rPr>
               <w:t>无</w:t>
             </w:r>
@@ -3790,7 +3840,8 @@
             <w:r/>
             <w:r>
               <w:rPr>
-                <w:sz w:val="20"/>
+                <w:rFonts w:ascii="Microsoft YaHei" w:hAnsi="Microsoft YaHei"/>
+                <w:sz w:val="18"/>
               </w:rPr>
               <w:t>合规</w:t>
             </w:r>
@@ -3812,9 +3863,10 @@
             <w:r/>
             <w:r>
               <w:rPr>
-                <w:sz w:val="20"/>
-              </w:rPr>
-              <w:t>VIF最大为Momentum的2.23</w:t>
+                <w:rFonts w:ascii="Microsoft YaHei" w:hAnsi="Microsoft YaHei"/>
+                <w:sz w:val="18"/>
+              </w:rPr>
+              <w:t>VIF最大为MoneyFlow的1.1039，远低于VIF&gt;5阈值。</w:t>
             </w:r>
           </w:p>
         </w:tc>
@@ -3924,97 +3976,102 @@
             <w:r/>
             <w:r>
               <w:rPr>
-                <w:sz w:val="20"/>
-              </w:rPr>
-              <w:t>data.py:compute_factors, line 112-153</w:t>
-            </w:r>
-          </w:p>
-        </w:tc>
-        <w:tc>
-          <w:tcPr>
-            <w:tcW w:w="0" w:type="auto"/>
-            <w:tcMar>
-              <w:top w:w="75" w:type="dxa"/>
-              <w:left w:w="150" w:type="dxa"/>
-              <w:bottom w:w="75" w:type="dxa"/>
-              <w:right w:w="150" w:type="dxa"/>
-            </w:tcMar>
-            <w:vAlign w:val="center"/>
-            <w:hideMark/>
-          </w:tcPr>
-          <w:p>
-            <w:r/>
-            <w:r>
-              <w:rPr>
-                <w:sz w:val="20"/>
-              </w:rPr>
-              <w:t>所有因子均有明确金融逻辑支撑</w:t>
-            </w:r>
-          </w:p>
-        </w:tc>
-        <w:tc>
-          <w:tcPr>
-            <w:tcW w:w="0" w:type="auto"/>
-            <w:tcMar>
-              <w:top w:w="75" w:type="dxa"/>
-              <w:left w:w="150" w:type="dxa"/>
-              <w:bottom w:w="75" w:type="dxa"/>
-              <w:right w:w="150" w:type="dxa"/>
-            </w:tcMar>
-            <w:vAlign w:val="center"/>
-            <w:hideMark/>
-          </w:tcPr>
-          <w:p>
-            <w:r/>
-            <w:r>
-              <w:rPr>
-                <w:sz w:val="20"/>
-              </w:rPr>
-              <w:t>无</w:t>
-            </w:r>
-          </w:p>
-        </w:tc>
-        <w:tc>
-          <w:tcPr>
-            <w:tcW w:w="0" w:type="auto"/>
-            <w:tcMar>
-              <w:top w:w="75" w:type="dxa"/>
-              <w:left w:w="150" w:type="dxa"/>
-              <w:bottom w:w="75" w:type="dxa"/>
-              <w:right w:w="150" w:type="dxa"/>
-            </w:tcMar>
-            <w:vAlign w:val="center"/>
-            <w:hideMark/>
-          </w:tcPr>
-          <w:p>
-            <w:r/>
-            <w:r>
-              <w:rPr>
-                <w:sz w:val="20"/>
-              </w:rPr>
-              <w:t>合规</w:t>
-            </w:r>
-          </w:p>
-        </w:tc>
-        <w:tc>
-          <w:tcPr>
-            <w:tcW w:w="0" w:type="auto"/>
-            <w:tcMar>
-              <w:top w:w="75" w:type="dxa"/>
-              <w:left w:w="150" w:type="dxa"/>
-              <w:bottom w:w="75" w:type="dxa"/>
-              <w:right w:w="150" w:type="dxa"/>
-            </w:tcMar>
-            <w:vAlign w:val="center"/>
-            <w:hideMark/>
-          </w:tcPr>
-          <w:p>
-            <w:r/>
-            <w:r>
-              <w:rPr>
-                <w:sz w:val="20"/>
-              </w:rPr>
-              <w:t>反转、流动性、资金流、价值均有理论依据</w:t>
+                <w:rFonts w:ascii="Microsoft YaHei" w:hAnsi="Microsoft YaHei"/>
+                <w:sz w:val="18"/>
+              </w:rPr>
+              <w:t>data.py:compute_factors</w:t>
+            </w:r>
+          </w:p>
+        </w:tc>
+        <w:tc>
+          <w:tcPr>
+            <w:tcW w:w="0" w:type="auto"/>
+            <w:tcMar>
+              <w:top w:w="75" w:type="dxa"/>
+              <w:left w:w="150" w:type="dxa"/>
+              <w:bottom w:w="75" w:type="dxa"/>
+              <w:right w:w="150" w:type="dxa"/>
+            </w:tcMar>
+            <w:vAlign w:val="center"/>
+            <w:hideMark/>
+          </w:tcPr>
+          <w:p>
+            <w:r/>
+            <w:r>
+              <w:rPr>
+                <w:rFonts w:ascii="Microsoft YaHei" w:hAnsi="Microsoft YaHei"/>
+                <w:sz w:val="18"/>
+              </w:rPr>
+              <w:t>本地数据缺少个股级buy_amount/sell_amount，MoneyFlow无法按原字段逐字实现。</w:t>
+            </w:r>
+          </w:p>
+        </w:tc>
+        <w:tc>
+          <w:tcPr>
+            <w:tcW w:w="0" w:type="auto"/>
+            <w:tcMar>
+              <w:top w:w="75" w:type="dxa"/>
+              <w:left w:w="150" w:type="dxa"/>
+              <w:bottom w:w="75" w:type="dxa"/>
+              <w:right w:w="150" w:type="dxa"/>
+            </w:tcMar>
+            <w:vAlign w:val="center"/>
+            <w:hideMark/>
+          </w:tcPr>
+          <w:p>
+            <w:r/>
+            <w:r>
+              <w:rPr>
+                <w:rFonts w:ascii="Microsoft YaHei" w:hAnsi="Microsoft YaHei"/>
+                <w:sz w:val="18"/>
+              </w:rPr>
+              <w:t>P1</w:t>
+            </w:r>
+          </w:p>
+        </w:tc>
+        <w:tc>
+          <w:tcPr>
+            <w:tcW w:w="0" w:type="auto"/>
+            <w:tcMar>
+              <w:top w:w="75" w:type="dxa"/>
+              <w:left w:w="150" w:type="dxa"/>
+              <w:bottom w:w="75" w:type="dxa"/>
+              <w:right w:w="150" w:type="dxa"/>
+            </w:tcMar>
+            <w:vAlign w:val="center"/>
+            <w:hideMark/>
+          </w:tcPr>
+          <w:p>
+            <w:r/>
+            <w:r>
+              <w:rPr>
+                <w:rFonts w:ascii="Microsoft YaHei" w:hAnsi="Microsoft YaHei"/>
+                <w:sz w:val="18"/>
+              </w:rPr>
+              <w:t>已修复</w:t>
+            </w:r>
+          </w:p>
+        </w:tc>
+        <w:tc>
+          <w:tcPr>
+            <w:tcW w:w="0" w:type="auto"/>
+            <w:tcMar>
+              <w:top w:w="75" w:type="dxa"/>
+              <w:left w:w="150" w:type="dxa"/>
+              <w:bottom w:w="75" w:type="dxa"/>
+              <w:right w:w="150" w:type="dxa"/>
+            </w:tcMar>
+            <w:vAlign w:val="center"/>
+            <w:hideMark/>
+          </w:tcPr>
+          <w:p>
+            <w:r/>
+            <w:r>
+              <w:rPr>
+                <w:rFonts w:ascii="Microsoft YaHei" w:hAnsi="Microsoft YaHei"/>
+                <w:sz w:val="18"/>
+              </w:rPr>
+              <w:t>使用5日滚动签名成交额净流入/circ_mv作为个股级代理；反转、流动性、资金流、价值均有经济含义。</w:t>
             </w:r>
           </w:p>
         </w:tc>
@@ -4557,51 +4614,54 @@
             <w:r/>
             <w:r>
               <w:rPr>
-                <w:sz w:val="20"/>
-              </w:rPr>
-              <w:t>config.py:COMMISSION_RATE, line 73</w:t>
-            </w:r>
-          </w:p>
-        </w:tc>
-        <w:tc>
-          <w:tcPr>
-            <w:tcW w:w="0" w:type="auto"/>
-            <w:tcMar>
-              <w:top w:w="75" w:type="dxa"/>
-              <w:left w:w="150" w:type="dxa"/>
-              <w:bottom w:w="75" w:type="dxa"/>
-              <w:right w:w="150" w:type="dxa"/>
-            </w:tcMar>
-            <w:vAlign w:val="center"/>
-            <w:hideMark/>
-          </w:tcPr>
-          <w:p>
-            <w:r/>
-            <w:r>
-              <w:rPr>
-                <w:sz w:val="20"/>
-              </w:rPr>
-              <w:t>单边0.1%，双边0.2%，含佣金+滑点</w:t>
-            </w:r>
-          </w:p>
-        </w:tc>
-        <w:tc>
-          <w:tcPr>
-            <w:tcW w:w="0" w:type="auto"/>
-            <w:tcMar>
-              <w:top w:w="75" w:type="dxa"/>
-              <w:left w:w="150" w:type="dxa"/>
-              <w:bottom w:w="75" w:type="dxa"/>
-              <w:right w:w="150" w:type="dxa"/>
-            </w:tcMar>
-            <w:vAlign w:val="center"/>
-            <w:hideMark/>
-          </w:tcPr>
-          <w:p>
-            <w:r/>
-            <w:r>
-              <w:rPr>
-                <w:sz w:val="20"/>
+                <w:rFonts w:ascii="Microsoft YaHei" w:hAnsi="Microsoft YaHei"/>
+                <w:sz w:val="18"/>
+              </w:rPr>
+              <w:t>config.py:COMMISSION_RATE</w:t>
+            </w:r>
+          </w:p>
+        </w:tc>
+        <w:tc>
+          <w:tcPr>
+            <w:tcW w:w="0" w:type="auto"/>
+            <w:tcMar>
+              <w:top w:w="75" w:type="dxa"/>
+              <w:left w:w="150" w:type="dxa"/>
+              <w:bottom w:w="75" w:type="dxa"/>
+              <w:right w:w="150" w:type="dxa"/>
+            </w:tcMar>
+            <w:vAlign w:val="center"/>
+            <w:hideMark/>
+          </w:tcPr>
+          <w:p>
+            <w:r/>
+            <w:r>
+              <w:rPr>
+                <w:rFonts w:ascii="Microsoft YaHei" w:hAnsi="Microsoft YaHei"/>
+                <w:sz w:val="18"/>
+              </w:rPr>
+              <w:t>交易成本需纳入回测，避免零成本理想化。</w:t>
+            </w:r>
+          </w:p>
+        </w:tc>
+        <w:tc>
+          <w:tcPr>
+            <w:tcW w:w="0" w:type="auto"/>
+            <w:tcMar>
+              <w:top w:w="75" w:type="dxa"/>
+              <w:left w:w="150" w:type="dxa"/>
+              <w:bottom w:w="75" w:type="dxa"/>
+              <w:right w:w="150" w:type="dxa"/>
+            </w:tcMar>
+            <w:vAlign w:val="center"/>
+            <w:hideMark/>
+          </w:tcPr>
+          <w:p>
+            <w:r/>
+            <w:r>
+              <w:rPr>
+                <w:rFonts w:ascii="Microsoft YaHei" w:hAnsi="Microsoft YaHei"/>
+                <w:sz w:val="18"/>
               </w:rPr>
               <w:t>P1</w:t>
             </w:r>
@@ -4623,31 +4683,33 @@
             <w:r/>
             <w:r>
               <w:rPr>
-                <w:sz w:val="20"/>
-              </w:rPr>
-              <w:t>合规</w:t>
-            </w:r>
-          </w:p>
-        </w:tc>
-        <w:tc>
-          <w:tcPr>
-            <w:tcW w:w="0" w:type="auto"/>
-            <w:tcMar>
-              <w:top w:w="75" w:type="dxa"/>
-              <w:left w:w="150" w:type="dxa"/>
-              <w:bottom w:w="75" w:type="dxa"/>
-              <w:right w:w="150" w:type="dxa"/>
-            </w:tcMar>
-            <w:vAlign w:val="center"/>
-            <w:hideMark/>
-          </w:tcPr>
-          <w:p>
-            <w:r/>
-            <w:r>
-              <w:rPr>
-                <w:sz w:val="20"/>
-              </w:rPr>
-              <w:t>考虑A股无资本利得税，0.1%单边合理</w:t>
+                <w:rFonts w:ascii="Microsoft YaHei" w:hAnsi="Microsoft YaHei"/>
+                <w:sz w:val="18"/>
+              </w:rPr>
+              <w:t>已修复</w:t>
+            </w:r>
+          </w:p>
+        </w:tc>
+        <w:tc>
+          <w:tcPr>
+            <w:tcW w:w="0" w:type="auto"/>
+            <w:tcMar>
+              <w:top w:w="75" w:type="dxa"/>
+              <w:left w:w="150" w:type="dxa"/>
+              <w:bottom w:w="75" w:type="dxa"/>
+              <w:right w:w="150" w:type="dxa"/>
+            </w:tcMar>
+            <w:vAlign w:val="center"/>
+            <w:hideMark/>
+          </w:tcPr>
+          <w:p>
+            <w:r/>
+            <w:r>
+              <w:rPr>
+                <w:rFonts w:ascii="Microsoft YaHei" w:hAnsi="Microsoft YaHei"/>
+                <w:sz w:val="18"/>
+              </w:rPr>
+              <w:t>单边成本0.1%；调仓按卖出+买入实际换手部分扣成本。</w:t>
             </w:r>
           </w:p>
         </w:tc>
@@ -4848,97 +4910,102 @@
             <w:r/>
             <w:r>
               <w:rPr>
-                <w:sz w:val="20"/>
-              </w:rPr>
-              <w:t>config.py:TOP_N_STOCKS, line 75</w:t>
-            </w:r>
-          </w:p>
-        </w:tc>
-        <w:tc>
-          <w:tcPr>
-            <w:tcW w:w="0" w:type="auto"/>
-            <w:tcMar>
-              <w:top w:w="75" w:type="dxa"/>
-              <w:left w:w="150" w:type="dxa"/>
-              <w:bottom w:w="75" w:type="dxa"/>
-              <w:right w:w="150" w:type="dxa"/>
-            </w:tcMar>
-            <w:vAlign w:val="center"/>
-            <w:hideMark/>
-          </w:tcPr>
-          <w:p>
-            <w:r/>
-            <w:r>
-              <w:rPr>
-                <w:sz w:val="20"/>
-              </w:rPr>
-              <w:t>5只等权，单票20%，总仓位100%</w:t>
-            </w:r>
-          </w:p>
-        </w:tc>
-        <w:tc>
-          <w:tcPr>
-            <w:tcW w:w="0" w:type="auto"/>
-            <w:tcMar>
-              <w:top w:w="75" w:type="dxa"/>
-              <w:left w:w="150" w:type="dxa"/>
-              <w:bottom w:w="75" w:type="dxa"/>
-              <w:right w:w="150" w:type="dxa"/>
-            </w:tcMar>
-            <w:vAlign w:val="center"/>
-            <w:hideMark/>
-          </w:tcPr>
-          <w:p>
-            <w:r/>
-            <w:r>
-              <w:rPr>
-                <w:sz w:val="20"/>
-              </w:rPr>
-              <w:t>P1</w:t>
-            </w:r>
-          </w:p>
-        </w:tc>
-        <w:tc>
-          <w:tcPr>
-            <w:tcW w:w="0" w:type="auto"/>
-            <w:tcMar>
-              <w:top w:w="75" w:type="dxa"/>
-              <w:left w:w="150" w:type="dxa"/>
-              <w:bottom w:w="75" w:type="dxa"/>
-              <w:right w:w="150" w:type="dxa"/>
-            </w:tcMar>
-            <w:vAlign w:val="center"/>
-            <w:hideMark/>
-          </w:tcPr>
-          <w:p>
-            <w:r/>
-            <w:r>
-              <w:rPr>
-                <w:sz w:val="20"/>
-              </w:rPr>
-              <w:t>部分修复</w:t>
-            </w:r>
-          </w:p>
-        </w:tc>
-        <w:tc>
-          <w:tcPr>
-            <w:tcW w:w="0" w:type="auto"/>
-            <w:tcMar>
-              <w:top w:w="75" w:type="dxa"/>
-              <w:left w:w="150" w:type="dxa"/>
-              <w:bottom w:w="75" w:type="dxa"/>
-              <w:right w:w="150" w:type="dxa"/>
-            </w:tcMar>
-            <w:vAlign w:val="center"/>
-            <w:hideMark/>
-          </w:tcPr>
-          <w:p>
-            <w:r/>
-            <w:r>
-              <w:rPr>
-                <w:sz w:val="20"/>
-              </w:rPr>
-              <w:t>总仓位100%满仓，未设置80%上限。作业要求选Top5等权，符合要求。</w:t>
+                <w:rFonts w:ascii="Microsoft YaHei" w:hAnsi="Microsoft YaHei"/>
+                <w:sz w:val="18"/>
+              </w:rPr>
+              <w:t>config.py:TOP_N_STOCKS</w:t>
+            </w:r>
+          </w:p>
+        </w:tc>
+        <w:tc>
+          <w:tcPr>
+            <w:tcW w:w="0" w:type="auto"/>
+            <w:tcMar>
+              <w:top w:w="75" w:type="dxa"/>
+              <w:left w:w="150" w:type="dxa"/>
+              <w:bottom w:w="75" w:type="dxa"/>
+              <w:right w:w="150" w:type="dxa"/>
+            </w:tcMar>
+            <w:vAlign w:val="center"/>
+            <w:hideMark/>
+          </w:tcPr>
+          <w:p>
+            <w:r/>
+            <w:r>
+              <w:rPr>
+                <w:rFonts w:ascii="Microsoft YaHei" w:hAnsi="Microsoft YaHei"/>
+                <w:sz w:val="18"/>
+              </w:rPr>
+              <w:t>策略为Top5等权，单票20%。总仓位100%符合题目规则，但实盘风险敞口偏高。</w:t>
+            </w:r>
+          </w:p>
+        </w:tc>
+        <w:tc>
+          <w:tcPr>
+            <w:tcW w:w="0" w:type="auto"/>
+            <w:tcMar>
+              <w:top w:w="75" w:type="dxa"/>
+              <w:left w:w="150" w:type="dxa"/>
+              <w:bottom w:w="75" w:type="dxa"/>
+              <w:right w:w="150" w:type="dxa"/>
+            </w:tcMar>
+            <w:vAlign w:val="center"/>
+            <w:hideMark/>
+          </w:tcPr>
+          <w:p>
+            <w:r/>
+            <w:r>
+              <w:rPr>
+                <w:rFonts w:ascii="Microsoft YaHei" w:hAnsi="Microsoft YaHei"/>
+                <w:sz w:val="18"/>
+              </w:rPr>
+              <w:t>P2</w:t>
+            </w:r>
+          </w:p>
+        </w:tc>
+        <w:tc>
+          <w:tcPr>
+            <w:tcW w:w="0" w:type="auto"/>
+            <w:tcMar>
+              <w:top w:w="75" w:type="dxa"/>
+              <w:left w:w="150" w:type="dxa"/>
+              <w:bottom w:w="75" w:type="dxa"/>
+              <w:right w:w="150" w:type="dxa"/>
+            </w:tcMar>
+            <w:vAlign w:val="center"/>
+            <w:hideMark/>
+          </w:tcPr>
+          <w:p>
+            <w:r/>
+            <w:r>
+              <w:rPr>
+                <w:rFonts w:ascii="Microsoft YaHei" w:hAnsi="Microsoft YaHei"/>
+                <w:sz w:val="18"/>
+              </w:rPr>
+              <w:t>保留</w:t>
+            </w:r>
+          </w:p>
+        </w:tc>
+        <w:tc>
+          <w:tcPr>
+            <w:tcW w:w="0" w:type="auto"/>
+            <w:tcMar>
+              <w:top w:w="75" w:type="dxa"/>
+              <w:left w:w="150" w:type="dxa"/>
+              <w:bottom w:w="75" w:type="dxa"/>
+              <w:right w:w="150" w:type="dxa"/>
+            </w:tcMar>
+            <w:vAlign w:val="center"/>
+            <w:hideMark/>
+          </w:tcPr>
+          <w:p>
+            <w:r/>
+            <w:r>
+              <w:rPr>
+                <w:rFonts w:ascii="Microsoft YaHei" w:hAnsi="Microsoft YaHei"/>
+                <w:sz w:val="18"/>
+              </w:rPr>
+              <w:t>作业要求Top5等权；后续实盘可增加总仓位上限或波动率目标仓位。</w:t>
             </w:r>
           </w:p>
         </w:tc>
@@ -5086,7 +5153,8 @@
             <w:r/>
             <w:r>
               <w:rPr>
-                <w:sz w:val="20"/>
+                <w:rFonts w:ascii="Microsoft YaHei" w:hAnsi="Microsoft YaHei"/>
+                <w:sz w:val="18"/>
               </w:rPr>
               <w:t>backtest.py</w:t>
             </w:r>
@@ -5108,29 +5176,31 @@
             <w:r/>
             <w:r>
               <w:rPr>
-                <w:sz w:val="20"/>
-              </w:rPr>
-              <w:t>无显式止损机制，依赖因子模型自动调仓</w:t>
-            </w:r>
-          </w:p>
-        </w:tc>
-        <w:tc>
-          <w:tcPr>
-            <w:tcW w:w="0" w:type="auto"/>
-            <w:tcMar>
-              <w:top w:w="75" w:type="dxa"/>
-              <w:left w:w="150" w:type="dxa"/>
-              <w:bottom w:w="75" w:type="dxa"/>
-              <w:right w:w="150" w:type="dxa"/>
-            </w:tcMar>
-            <w:vAlign w:val="center"/>
-            <w:hideMark/>
-          </w:tcPr>
-          <w:p>
-            <w:r/>
-            <w:r>
-              <w:rPr>
-                <w:sz w:val="20"/>
+                <w:rFonts w:ascii="Microsoft YaHei" w:hAnsi="Microsoft YaHei"/>
+                <w:sz w:val="18"/>
+              </w:rPr>
+              <w:t>当前无显式止损机制，主要依靠每日调仓和模型重新打分控制风险。</w:t>
+            </w:r>
+          </w:p>
+        </w:tc>
+        <w:tc>
+          <w:tcPr>
+            <w:tcW w:w="0" w:type="auto"/>
+            <w:tcMar>
+              <w:top w:w="75" w:type="dxa"/>
+              <w:left w:w="150" w:type="dxa"/>
+              <w:bottom w:w="75" w:type="dxa"/>
+              <w:right w:w="150" w:type="dxa"/>
+            </w:tcMar>
+            <w:vAlign w:val="center"/>
+            <w:hideMark/>
+          </w:tcPr>
+          <w:p>
+            <w:r/>
+            <w:r>
+              <w:rPr>
+                <w:rFonts w:ascii="Microsoft YaHei" w:hAnsi="Microsoft YaHei"/>
+                <w:sz w:val="18"/>
               </w:rPr>
               <w:t>P2</w:t>
             </w:r>
@@ -5152,7 +5222,8 @@
             <w:r/>
             <w:r>
               <w:rPr>
-                <w:sz w:val="20"/>
+                <w:rFonts w:ascii="Microsoft YaHei" w:hAnsi="Microsoft YaHei"/>
+                <w:sz w:val="18"/>
               </w:rPr>
               <w:t>待优化</w:t>
             </w:r>
@@ -5174,9 +5245,10 @@
             <w:r/>
             <w:r>
               <w:rPr>
-                <w:sz w:val="20"/>
-              </w:rPr>
-              <w:t>当前依赖LGBM模型自动选股实现风控</w:t>
+                <w:rFonts w:ascii="Microsoft YaHei" w:hAnsi="Microsoft YaHei"/>
+                <w:sz w:val="18"/>
+              </w:rPr>
+              <w:t>本次按作业要求完成回测；后续可加入单票止损和账户回撤控制。</w:t>
             </w:r>
           </w:p>
         </w:tc>
@@ -5307,51 +5379,54 @@
             <w:r/>
             <w:r>
               <w:rPr>
-                <w:sz w:val="20"/>
-              </w:rPr>
-              <w:t>data.py:load_parquet_data, line 31-32</w:t>
-            </w:r>
-          </w:p>
-        </w:tc>
-        <w:tc>
-          <w:tcPr>
-            <w:tcW w:w="0" w:type="auto"/>
-            <w:tcMar>
-              <w:top w:w="75" w:type="dxa"/>
-              <w:left w:w="150" w:type="dxa"/>
-              <w:bottom w:w="75" w:type="dxa"/>
-              <w:right w:w="150" w:type="dxa"/>
-            </w:tcMar>
-            <w:vAlign w:val="center"/>
-            <w:hideMark/>
-          </w:tcPr>
-          <w:p>
-            <w:r/>
-            <w:r>
-              <w:rPr>
-                <w:sz w:val="20"/>
-              </w:rPr>
-              <w:t>沪深300成分股天然具有高流动性</w:t>
-            </w:r>
-          </w:p>
-        </w:tc>
-        <w:tc>
-          <w:tcPr>
-            <w:tcW w:w="0" w:type="auto"/>
-            <w:tcMar>
-              <w:top w:w="75" w:type="dxa"/>
-              <w:left w:w="150" w:type="dxa"/>
-              <w:bottom w:w="75" w:type="dxa"/>
-              <w:right w:w="150" w:type="dxa"/>
-            </w:tcMar>
-            <w:vAlign w:val="center"/>
-            <w:hideMark/>
-          </w:tcPr>
-          <w:p>
-            <w:r/>
-            <w:r>
-              <w:rPr>
-                <w:sz w:val="20"/>
+                <w:rFonts w:ascii="Microsoft YaHei" w:hAnsi="Microsoft YaHei"/>
+                <w:sz w:val="18"/>
+              </w:rPr>
+              <w:t>data.py:load_parquet_data</w:t>
+            </w:r>
+          </w:p>
+        </w:tc>
+        <w:tc>
+          <w:tcPr>
+            <w:tcW w:w="0" w:type="auto"/>
+            <w:tcMar>
+              <w:top w:w="75" w:type="dxa"/>
+              <w:left w:w="150" w:type="dxa"/>
+              <w:bottom w:w="75" w:type="dxa"/>
+              <w:right w:w="150" w:type="dxa"/>
+            </w:tcMar>
+            <w:vAlign w:val="center"/>
+            <w:hideMark/>
+          </w:tcPr>
+          <w:p>
+            <w:r/>
+            <w:r>
+              <w:rPr>
+                <w:rFonts w:ascii="Microsoft YaHei" w:hAnsi="Microsoft YaHei"/>
+                <w:sz w:val="18"/>
+              </w:rPr>
+              <w:t>标的池需满足流动性，避免无法成交。</w:t>
+            </w:r>
+          </w:p>
+        </w:tc>
+        <w:tc>
+          <w:tcPr>
+            <w:tcW w:w="0" w:type="auto"/>
+            <w:tcMar>
+              <w:top w:w="75" w:type="dxa"/>
+              <w:left w:w="150" w:type="dxa"/>
+              <w:bottom w:w="75" w:type="dxa"/>
+              <w:right w:w="150" w:type="dxa"/>
+            </w:tcMar>
+            <w:vAlign w:val="center"/>
+            <w:hideMark/>
+          </w:tcPr>
+          <w:p>
+            <w:r/>
+            <w:r>
+              <w:rPr>
+                <w:rFonts w:ascii="Microsoft YaHei" w:hAnsi="Microsoft YaHei"/>
+                <w:sz w:val="18"/>
               </w:rPr>
               <w:t>无</w:t>
             </w:r>
@@ -5373,7 +5448,8 @@
             <w:r/>
             <w:r>
               <w:rPr>
-                <w:sz w:val="20"/>
+                <w:rFonts w:ascii="Microsoft YaHei" w:hAnsi="Microsoft YaHei"/>
+                <w:sz w:val="18"/>
               </w:rPr>
               <w:t>合规</w:t>
             </w:r>
@@ -5395,9 +5471,10 @@
             <w:r/>
             <w:r>
               <w:rPr>
-                <w:sz w:val="20"/>
-              </w:rPr>
-              <w:t>成分股为A股流动性最优标的</w:t>
+                <w:rFonts w:ascii="Microsoft YaHei" w:hAnsi="Microsoft YaHei"/>
+                <w:sz w:val="18"/>
+              </w:rPr>
+              <w:t>使用沪深300成分股，属于A股流动性较优股票池。</w:t>
             </w:r>
           </w:p>
         </w:tc>
@@ -5567,51 +5644,54 @@
             <w:r/>
             <w:r>
               <w:rPr>
-                <w:sz w:val="20"/>
-              </w:rPr>
-              <w:t>config.py:HOLDING_DAYS, line 76</w:t>
-            </w:r>
-          </w:p>
-        </w:tc>
-        <w:tc>
-          <w:tcPr>
-            <w:tcW w:w="0" w:type="auto"/>
-            <w:tcMar>
-              <w:top w:w="75" w:type="dxa"/>
-              <w:left w:w="150" w:type="dxa"/>
-              <w:bottom w:w="75" w:type="dxa"/>
-              <w:right w:w="150" w:type="dxa"/>
-            </w:tcMar>
-            <w:vAlign w:val="center"/>
-            <w:hideMark/>
-          </w:tcPr>
-          <w:p>
-            <w:r/>
-            <w:r>
-              <w:rPr>
-                <w:sz w:val="20"/>
-              </w:rPr>
-              <w:t>每日调仓，平均持仓1~2日</w:t>
-            </w:r>
-          </w:p>
-        </w:tc>
-        <w:tc>
-          <w:tcPr>
-            <w:tcW w:w="0" w:type="auto"/>
-            <w:tcMar>
-              <w:top w:w="75" w:type="dxa"/>
-              <w:left w:w="150" w:type="dxa"/>
-              <w:bottom w:w="75" w:type="dxa"/>
-              <w:right w:w="150" w:type="dxa"/>
-            </w:tcMar>
-            <w:vAlign w:val="center"/>
-            <w:hideMark/>
-          </w:tcPr>
-          <w:p>
-            <w:r/>
-            <w:r>
-              <w:rPr>
-                <w:sz w:val="20"/>
+                <w:rFonts w:ascii="Microsoft YaHei" w:hAnsi="Microsoft YaHei"/>
+                <w:sz w:val="18"/>
+              </w:rPr>
+              <w:t>config.py:HOLDING_DAYS</w:t>
+            </w:r>
+          </w:p>
+        </w:tc>
+        <w:tc>
+          <w:tcPr>
+            <w:tcW w:w="0" w:type="auto"/>
+            <w:tcMar>
+              <w:top w:w="75" w:type="dxa"/>
+              <w:left w:w="150" w:type="dxa"/>
+              <w:bottom w:w="75" w:type="dxa"/>
+              <w:right w:w="150" w:type="dxa"/>
+            </w:tcMar>
+            <w:vAlign w:val="center"/>
+            <w:hideMark/>
+          </w:tcPr>
+          <w:p>
+            <w:r/>
+            <w:r>
+              <w:rPr>
+                <w:rFonts w:ascii="Microsoft YaHei" w:hAnsi="Microsoft YaHei"/>
+                <w:sz w:val="18"/>
+              </w:rPr>
+              <w:t>需符合1~2日中频短线持仓规则。</w:t>
+            </w:r>
+          </w:p>
+        </w:tc>
+        <w:tc>
+          <w:tcPr>
+            <w:tcW w:w="0" w:type="auto"/>
+            <w:tcMar>
+              <w:top w:w="75" w:type="dxa"/>
+              <w:left w:w="150" w:type="dxa"/>
+              <w:bottom w:w="75" w:type="dxa"/>
+              <w:right w:w="150" w:type="dxa"/>
+            </w:tcMar>
+            <w:vAlign w:val="center"/>
+            <w:hideMark/>
+          </w:tcPr>
+          <w:p>
+            <w:r/>
+            <w:r>
+              <w:rPr>
+                <w:rFonts w:ascii="Microsoft YaHei" w:hAnsi="Microsoft YaHei"/>
+                <w:sz w:val="18"/>
               </w:rPr>
               <w:t>无</w:t>
             </w:r>
@@ -5633,7 +5713,8 @@
             <w:r/>
             <w:r>
               <w:rPr>
-                <w:sz w:val="20"/>
+                <w:rFonts w:ascii="Microsoft YaHei" w:hAnsi="Microsoft YaHei"/>
+                <w:sz w:val="18"/>
               </w:rPr>
               <w:t>合规</w:t>
             </w:r>
@@ -5655,9 +5736,10 @@
             <w:r/>
             <w:r>
               <w:rPr>
-                <w:sz w:val="20"/>
-              </w:rPr>
-              <w:t>符合中频1~2日持仓要求</w:t>
+                <w:rFonts w:ascii="Microsoft YaHei" w:hAnsi="Microsoft YaHei"/>
+                <w:sz w:val="18"/>
+              </w:rPr>
+              <w:t>HOLDING_DAYS=1，每日调仓，平均持仓1~2日。</w:t>
             </w:r>
           </w:p>
         </w:tc>
@@ -6205,51 +6287,54 @@
             <w:r/>
             <w:r>
               <w:rPr>
-                <w:sz w:val="20"/>
-              </w:rPr>
-              <w:t>全局</w:t>
-            </w:r>
-          </w:p>
-        </w:tc>
-        <w:tc>
-          <w:tcPr>
-            <w:tcW w:w="0" w:type="auto"/>
-            <w:tcMar>
-              <w:top w:w="75" w:type="dxa"/>
-              <w:left w:w="150" w:type="dxa"/>
-              <w:bottom w:w="75" w:type="dxa"/>
-              <w:right w:w="150" w:type="dxa"/>
-            </w:tcMar>
-            <w:vAlign w:val="center"/>
-            <w:hideMark/>
-          </w:tcPr>
-          <w:p>
-            <w:r/>
-            <w:r>
-              <w:rPr>
-                <w:sz w:val="20"/>
-              </w:rPr>
-              <w:t>所有import的库均真实存在（pandas, numpy, lightgbm, scipy等）</w:t>
-            </w:r>
-          </w:p>
-        </w:tc>
-        <w:tc>
-          <w:tcPr>
-            <w:tcW w:w="0" w:type="auto"/>
-            <w:tcMar>
-              <w:top w:w="75" w:type="dxa"/>
-              <w:left w:w="150" w:type="dxa"/>
-              <w:bottom w:w="75" w:type="dxa"/>
-              <w:right w:w="150" w:type="dxa"/>
-            </w:tcMar>
-            <w:vAlign w:val="center"/>
-            <w:hideMark/>
-          </w:tcPr>
-          <w:p>
-            <w:r/>
-            <w:r>
-              <w:rPr>
-                <w:sz w:val="20"/>
+                <w:rFonts w:ascii="Microsoft YaHei" w:hAnsi="Microsoft YaHei"/>
+                <w:sz w:val="18"/>
+              </w:rPr>
+              <w:t>requirements.txt / imports</w:t>
+            </w:r>
+          </w:p>
+        </w:tc>
+        <w:tc>
+          <w:tcPr>
+            <w:tcW w:w="0" w:type="auto"/>
+            <w:tcMar>
+              <w:top w:w="75" w:type="dxa"/>
+              <w:left w:w="150" w:type="dxa"/>
+              <w:bottom w:w="75" w:type="dxa"/>
+              <w:right w:w="150" w:type="dxa"/>
+            </w:tcMar>
+            <w:vAlign w:val="center"/>
+            <w:hideMark/>
+          </w:tcPr>
+          <w:p>
+            <w:r/>
+            <w:r>
+              <w:rPr>
+                <w:rFonts w:ascii="Microsoft YaHei" w:hAnsi="Microsoft YaHei"/>
+                <w:sz w:val="18"/>
+              </w:rPr>
+              <w:t>需检查是否存在AI虚构库或不存在API。</w:t>
+            </w:r>
+          </w:p>
+        </w:tc>
+        <w:tc>
+          <w:tcPr>
+            <w:tcW w:w="0" w:type="auto"/>
+            <w:tcMar>
+              <w:top w:w="75" w:type="dxa"/>
+              <w:left w:w="150" w:type="dxa"/>
+              <w:bottom w:w="75" w:type="dxa"/>
+              <w:right w:w="150" w:type="dxa"/>
+            </w:tcMar>
+            <w:vAlign w:val="center"/>
+            <w:hideMark/>
+          </w:tcPr>
+          <w:p>
+            <w:r/>
+            <w:r>
+              <w:rPr>
+                <w:rFonts w:ascii="Microsoft YaHei" w:hAnsi="Microsoft YaHei"/>
+                <w:sz w:val="18"/>
               </w:rPr>
               <w:t>无</w:t>
             </w:r>
@@ -6271,7 +6356,8 @@
             <w:r/>
             <w:r>
               <w:rPr>
-                <w:sz w:val="20"/>
+                <w:rFonts w:ascii="Microsoft YaHei" w:hAnsi="Microsoft YaHei"/>
+                <w:sz w:val="18"/>
               </w:rPr>
               <w:t>合规</w:t>
             </w:r>
@@ -6293,9 +6379,10 @@
             <w:r/>
             <w:r>
               <w:rPr>
-                <w:sz w:val="20"/>
-              </w:rPr>
-              <w:t>已验证所有依赖版本兼容</w:t>
+                <w:rFonts w:ascii="Microsoft YaHei" w:hAnsi="Microsoft YaHei"/>
+                <w:sz w:val="18"/>
+              </w:rPr>
+              <w:t>已验证pandas、numpy、scipy、lightgbm、python-pptx等依赖可导入。</w:t>
             </w:r>
           </w:p>
         </w:tc>
@@ -6387,51 +6474,54 @@
             <w:r/>
             <w:r>
               <w:rPr>
-                <w:sz w:val="20"/>
-              </w:rPr>
-              <w:t>backtest.py:run_backtest, line 40-157</w:t>
-            </w:r>
-          </w:p>
-        </w:tc>
-        <w:tc>
-          <w:tcPr>
-            <w:tcW w:w="0" w:type="auto"/>
-            <w:tcMar>
-              <w:top w:w="75" w:type="dxa"/>
-              <w:left w:w="150" w:type="dxa"/>
-              <w:bottom w:w="75" w:type="dxa"/>
-              <w:right w:w="150" w:type="dxa"/>
-            </w:tcMar>
-            <w:vAlign w:val="center"/>
-            <w:hideMark/>
-          </w:tcPr>
-          <w:p>
-            <w:r/>
-            <w:r>
-              <w:rPr>
-                <w:sz w:val="20"/>
-              </w:rPr>
-              <w:t>条件判断清晰，交易方向明确</w:t>
-            </w:r>
-          </w:p>
-        </w:tc>
-        <w:tc>
-          <w:tcPr>
-            <w:tcW w:w="0" w:type="auto"/>
-            <w:tcMar>
-              <w:top w:w="75" w:type="dxa"/>
-              <w:left w:w="150" w:type="dxa"/>
-              <w:bottom w:w="75" w:type="dxa"/>
-              <w:right w:w="150" w:type="dxa"/>
-            </w:tcMar>
-            <w:vAlign w:val="center"/>
-            <w:hideMark/>
-          </w:tcPr>
-          <w:p>
-            <w:r/>
-            <w:r>
-              <w:rPr>
-                <w:sz w:val="20"/>
+                <w:rFonts w:ascii="Microsoft YaHei" w:hAnsi="Microsoft YaHei"/>
+                <w:sz w:val="18"/>
+              </w:rPr>
+              <w:t>backtest.py</w:t>
+            </w:r>
+          </w:p>
+        </w:tc>
+        <w:tc>
+          <w:tcPr>
+            <w:tcW w:w="0" w:type="auto"/>
+            <w:tcMar>
+              <w:top w:w="75" w:type="dxa"/>
+              <w:left w:w="150" w:type="dxa"/>
+              <w:bottom w:w="75" w:type="dxa"/>
+              <w:right w:w="150" w:type="dxa"/>
+            </w:tcMar>
+            <w:vAlign w:val="center"/>
+            <w:hideMark/>
+          </w:tcPr>
+          <w:p>
+            <w:r/>
+            <w:r>
+              <w:rPr>
+                <w:rFonts w:ascii="Microsoft YaHei" w:hAnsi="Microsoft YaHei"/>
+                <w:sz w:val="18"/>
+              </w:rPr>
+              <w:t>需检查买卖逻辑是否出现同时冲突或重复扣费。</w:t>
+            </w:r>
+          </w:p>
+        </w:tc>
+        <w:tc>
+          <w:tcPr>
+            <w:tcW w:w="0" w:type="auto"/>
+            <w:tcMar>
+              <w:top w:w="75" w:type="dxa"/>
+              <w:left w:w="150" w:type="dxa"/>
+              <w:bottom w:w="75" w:type="dxa"/>
+              <w:right w:w="150" w:type="dxa"/>
+            </w:tcMar>
+            <w:vAlign w:val="center"/>
+            <w:hideMark/>
+          </w:tcPr>
+          <w:p>
+            <w:r/>
+            <w:r>
+              <w:rPr>
+                <w:rFonts w:ascii="Microsoft YaHei" w:hAnsi="Microsoft YaHei"/>
+                <w:sz w:val="18"/>
               </w:rPr>
               <w:t>无</w:t>
             </w:r>
@@ -6453,7 +6543,8 @@
             <w:r/>
             <w:r>
               <w:rPr>
-                <w:sz w:val="20"/>
+                <w:rFonts w:ascii="Microsoft YaHei" w:hAnsi="Microsoft YaHei"/>
+                <w:sz w:val="18"/>
               </w:rPr>
               <w:t>合规</w:t>
             </w:r>
@@ -6475,9 +6566,10 @@
             <w:r/>
             <w:r>
               <w:rPr>
-                <w:sz w:val="20"/>
-              </w:rPr>
-              <w:t>买入/卖出逻辑无冲突</w:t>
+                <w:rFonts w:ascii="Microsoft YaHei" w:hAnsi="Microsoft YaHei"/>
+                <w:sz w:val="18"/>
+              </w:rPr>
+              <w:t>先结算旧持仓收益，再按新旧持仓差异扣买卖成本，逻辑清晰。</w:t>
             </w:r>
           </w:p>
         </w:tc>
@@ -6609,51 +6701,54 @@
             <w:r/>
             <w:r>
               <w:rPr>
-                <w:sz w:val="20"/>
-              </w:rPr>
-              <w:t>models.py:train_lgbm_with_cv, line 44-141</w:t>
-            </w:r>
-          </w:p>
-        </w:tc>
-        <w:tc>
-          <w:tcPr>
-            <w:tcW w:w="0" w:type="auto"/>
-            <w:tcMar>
-              <w:top w:w="75" w:type="dxa"/>
-              <w:left w:w="150" w:type="dxa"/>
-              <w:bottom w:w="75" w:type="dxa"/>
-              <w:right w:w="150" w:type="dxa"/>
-            </w:tcMar>
-            <w:vAlign w:val="center"/>
-            <w:hideMark/>
-          </w:tcPr>
-          <w:p>
-            <w:r/>
-            <w:r>
-              <w:rPr>
-                <w:sz w:val="20"/>
-              </w:rPr>
-              <w:t>使用时间序列CV，早停机制防止过拟合</w:t>
-            </w:r>
-          </w:p>
-        </w:tc>
-        <w:tc>
-          <w:tcPr>
-            <w:tcW w:w="0" w:type="auto"/>
-            <w:tcMar>
-              <w:top w:w="75" w:type="dxa"/>
-              <w:left w:w="150" w:type="dxa"/>
-              <w:bottom w:w="75" w:type="dxa"/>
-              <w:right w:w="150" w:type="dxa"/>
-            </w:tcMar>
-            <w:vAlign w:val="center"/>
-            <w:hideMark/>
-          </w:tcPr>
-          <w:p>
-            <w:r/>
-            <w:r>
-              <w:rPr>
-                <w:sz w:val="20"/>
+                <w:rFonts w:ascii="Microsoft YaHei" w:hAnsi="Microsoft YaHei"/>
+                <w:sz w:val="18"/>
+              </w:rPr>
+              <w:t>models.py</w:t>
+            </w:r>
+          </w:p>
+        </w:tc>
+        <w:tc>
+          <w:tcPr>
+            <w:tcW w:w="0" w:type="auto"/>
+            <w:tcMar>
+              <w:top w:w="75" w:type="dxa"/>
+              <w:left w:w="150" w:type="dxa"/>
+              <w:bottom w:w="75" w:type="dxa"/>
+              <w:right w:w="150" w:type="dxa"/>
+            </w:tcMar>
+            <w:vAlign w:val="center"/>
+            <w:hideMark/>
+          </w:tcPr>
+          <w:p>
+            <w:r/>
+            <w:r>
+              <w:rPr>
+                <w:rFonts w:ascii="Microsoft YaHei" w:hAnsi="Microsoft YaHei"/>
+                <w:sz w:val="18"/>
+              </w:rPr>
+              <w:t>机器学习模型需避免过拟合和未来数据泄露。</w:t>
+            </w:r>
+          </w:p>
+        </w:tc>
+        <w:tc>
+          <w:tcPr>
+            <w:tcW w:w="0" w:type="auto"/>
+            <w:tcMar>
+              <w:top w:w="75" w:type="dxa"/>
+              <w:left w:w="150" w:type="dxa"/>
+              <w:bottom w:w="75" w:type="dxa"/>
+              <w:right w:w="150" w:type="dxa"/>
+            </w:tcMar>
+            <w:vAlign w:val="center"/>
+            <w:hideMark/>
+          </w:tcPr>
+          <w:p>
+            <w:r/>
+            <w:r>
+              <w:rPr>
+                <w:rFonts w:ascii="Microsoft YaHei" w:hAnsi="Microsoft YaHei"/>
+                <w:sz w:val="18"/>
               </w:rPr>
               <w:t>无</w:t>
             </w:r>
@@ -6675,7 +6770,8 @@
             <w:r/>
             <w:r>
               <w:rPr>
-                <w:sz w:val="20"/>
+                <w:rFonts w:ascii="Microsoft YaHei" w:hAnsi="Microsoft YaHei"/>
+                <w:sz w:val="18"/>
               </w:rPr>
               <w:t>合规</w:t>
             </w:r>
@@ -6697,9 +6793,10 @@
             <w:r/>
             <w:r>
               <w:rPr>
-                <w:sz w:val="20"/>
-              </w:rPr>
-              <w:t>早停20轮，最佳迭代次数9-41</w:t>
+                <w:rFonts w:ascii="Microsoft YaHei" w:hAnsi="Microsoft YaHei"/>
+                <w:sz w:val="18"/>
+              </w:rPr>
+              <w:t>使用时间序列扩展窗口CV，验证窗口始终位于训练窗口之后。</w:t>
             </w:r>
           </w:p>
         </w:tc>
@@ -6809,97 +6906,102 @@
             <w:r/>
             <w:r>
               <w:rPr>
-                <w:sz w:val="20"/>
-              </w:rPr>
-              <w:t>config.py</w:t>
-            </w:r>
-          </w:p>
-        </w:tc>
-        <w:tc>
-          <w:tcPr>
-            <w:tcW w:w="0" w:type="auto"/>
-            <w:tcMar>
-              <w:top w:w="75" w:type="dxa"/>
-              <w:left w:w="150" w:type="dxa"/>
-              <w:bottom w:w="75" w:type="dxa"/>
-              <w:right w:w="150" w:type="dxa"/>
-            </w:tcMar>
-            <w:vAlign w:val="center"/>
-            <w:hideMark/>
-          </w:tcPr>
-          <w:p>
-            <w:r/>
-            <w:r>
-              <w:rPr>
-                <w:sz w:val="20"/>
-              </w:rPr>
-              <w:t>所有关键参数均可配置</w:t>
-            </w:r>
-          </w:p>
-        </w:tc>
-        <w:tc>
-          <w:tcPr>
-            <w:tcW w:w="0" w:type="auto"/>
-            <w:tcMar>
-              <w:top w:w="75" w:type="dxa"/>
-              <w:left w:w="150" w:type="dxa"/>
-              <w:bottom w:w="75" w:type="dxa"/>
-              <w:right w:w="150" w:type="dxa"/>
-            </w:tcMar>
-            <w:vAlign w:val="center"/>
-            <w:hideMark/>
-          </w:tcPr>
-          <w:p>
-            <w:r/>
-            <w:r>
-              <w:rPr>
-                <w:sz w:val="20"/>
-              </w:rPr>
-              <w:t>无</w:t>
-            </w:r>
-          </w:p>
-        </w:tc>
-        <w:tc>
-          <w:tcPr>
-            <w:tcW w:w="0" w:type="auto"/>
-            <w:tcMar>
-              <w:top w:w="75" w:type="dxa"/>
-              <w:left w:w="150" w:type="dxa"/>
-              <w:bottom w:w="75" w:type="dxa"/>
-              <w:right w:w="150" w:type="dxa"/>
-            </w:tcMar>
-            <w:vAlign w:val="center"/>
-            <w:hideMark/>
-          </w:tcPr>
-          <w:p>
-            <w:r/>
-            <w:r>
-              <w:rPr>
-                <w:sz w:val="20"/>
-              </w:rPr>
-              <w:t>合规</w:t>
-            </w:r>
-          </w:p>
-        </w:tc>
-        <w:tc>
-          <w:tcPr>
-            <w:tcW w:w="0" w:type="auto"/>
-            <w:tcMar>
-              <w:top w:w="75" w:type="dxa"/>
-              <w:left w:w="150" w:type="dxa"/>
-              <w:bottom w:w="75" w:type="dxa"/>
-              <w:right w:w="150" w:type="dxa"/>
-            </w:tcMar>
-            <w:vAlign w:val="center"/>
-            <w:hideMark/>
-          </w:tcPr>
-          <w:p>
-            <w:r/>
-            <w:r>
-              <w:rPr>
-                <w:sz w:val="20"/>
-              </w:rPr>
-              <w:t>集中在config.py管理</w:t>
+                <w:rFonts w:ascii="Microsoft YaHei" w:hAnsi="Microsoft YaHei"/>
+                <w:sz w:val="18"/>
+              </w:rPr>
+              <w:t>report/build_homework4b_ppt.py</w:t>
+            </w:r>
+          </w:p>
+        </w:tc>
+        <w:tc>
+          <w:tcPr>
+            <w:tcW w:w="0" w:type="auto"/>
+            <w:tcMar>
+              <w:top w:w="75" w:type="dxa"/>
+              <w:left w:w="150" w:type="dxa"/>
+              <w:bottom w:w="75" w:type="dxa"/>
+              <w:right w:w="150" w:type="dxa"/>
+            </w:tcMar>
+            <w:vAlign w:val="center"/>
+            <w:hideMark/>
+          </w:tcPr>
+          <w:p>
+            <w:r/>
+            <w:r>
+              <w:rPr>
+                <w:rFonts w:ascii="Microsoft YaHei" w:hAnsi="Microsoft YaHei"/>
+                <w:sz w:val="18"/>
+              </w:rPr>
+              <w:t>原PPT脚本写死旧收益和8因子结论，重跑后会展示错误数字。</w:t>
+            </w:r>
+          </w:p>
+        </w:tc>
+        <w:tc>
+          <w:tcPr>
+            <w:tcW w:w="0" w:type="auto"/>
+            <w:tcMar>
+              <w:top w:w="75" w:type="dxa"/>
+              <w:left w:w="150" w:type="dxa"/>
+              <w:bottom w:w="75" w:type="dxa"/>
+              <w:right w:w="150" w:type="dxa"/>
+            </w:tcMar>
+            <w:vAlign w:val="center"/>
+            <w:hideMark/>
+          </w:tcPr>
+          <w:p>
+            <w:r/>
+            <w:r>
+              <w:rPr>
+                <w:rFonts w:ascii="Microsoft YaHei" w:hAnsi="Microsoft YaHei"/>
+                <w:sz w:val="18"/>
+              </w:rPr>
+              <w:t>P1</w:t>
+            </w:r>
+          </w:p>
+        </w:tc>
+        <w:tc>
+          <w:tcPr>
+            <w:tcW w:w="0" w:type="auto"/>
+            <w:tcMar>
+              <w:top w:w="75" w:type="dxa"/>
+              <w:left w:w="150" w:type="dxa"/>
+              <w:bottom w:w="75" w:type="dxa"/>
+              <w:right w:w="150" w:type="dxa"/>
+            </w:tcMar>
+            <w:vAlign w:val="center"/>
+            <w:hideMark/>
+          </w:tcPr>
+          <w:p>
+            <w:r/>
+            <w:r>
+              <w:rPr>
+                <w:rFonts w:ascii="Microsoft YaHei" w:hAnsi="Microsoft YaHei"/>
+                <w:sz w:val="18"/>
+              </w:rPr>
+              <w:t>已修复</w:t>
+            </w:r>
+          </w:p>
+        </w:tc>
+        <w:tc>
+          <w:tcPr>
+            <w:tcW w:w="0" w:type="auto"/>
+            <w:tcMar>
+              <w:top w:w="75" w:type="dxa"/>
+              <w:left w:w="150" w:type="dxa"/>
+              <w:bottom w:w="75" w:type="dxa"/>
+              <w:right w:w="150" w:type="dxa"/>
+            </w:tcMar>
+            <w:vAlign w:val="center"/>
+            <w:hideMark/>
+          </w:tcPr>
+          <w:p>
+            <w:r/>
+            <w:r>
+              <w:rPr>
+                <w:rFonts w:ascii="Microsoft YaHei" w:hAnsi="Microsoft YaHei"/>
+                <w:sz w:val="18"/>
+              </w:rPr>
+              <w:t>PPT脚本改为读取最新CSV/JSON自动生成，旧版硬编码收益数字已移除。</w:t>
             </w:r>
           </w:p>
         </w:tc>
@@ -7009,97 +7111,102 @@
             <w:r/>
             <w:r>
               <w:rPr>
-                <w:sz w:val="20"/>
-              </w:rPr>
-              <w:t>全局</w:t>
-            </w:r>
-          </w:p>
-        </w:tc>
-        <w:tc>
-          <w:tcPr>
-            <w:tcW w:w="0" w:type="auto"/>
-            <w:tcMar>
-              <w:top w:w="75" w:type="dxa"/>
-              <w:left w:w="150" w:type="dxa"/>
-              <w:bottom w:w="75" w:type="dxa"/>
-              <w:right w:w="150" w:type="dxa"/>
-            </w:tcMar>
-            <w:vAlign w:val="center"/>
-            <w:hideMark/>
-          </w:tcPr>
-          <w:p>
-            <w:r/>
-            <w:r>
-              <w:rPr>
-                <w:sz w:val="20"/>
-              </w:rPr>
-              <w:t>代码结构清晰，无重复逻辑</w:t>
-            </w:r>
-          </w:p>
-        </w:tc>
-        <w:tc>
-          <w:tcPr>
-            <w:tcW w:w="0" w:type="auto"/>
-            <w:tcMar>
-              <w:top w:w="75" w:type="dxa"/>
-              <w:left w:w="150" w:type="dxa"/>
-              <w:bottom w:w="75" w:type="dxa"/>
-              <w:right w:w="150" w:type="dxa"/>
-            </w:tcMar>
-            <w:vAlign w:val="center"/>
-            <w:hideMark/>
-          </w:tcPr>
-          <w:p>
-            <w:r/>
-            <w:r>
-              <w:rPr>
-                <w:sz w:val="20"/>
-              </w:rPr>
-              <w:t>无</w:t>
-            </w:r>
-          </w:p>
-        </w:tc>
-        <w:tc>
-          <w:tcPr>
-            <w:tcW w:w="0" w:type="auto"/>
-            <w:tcMar>
-              <w:top w:w="75" w:type="dxa"/>
-              <w:left w:w="150" w:type="dxa"/>
-              <w:bottom w:w="75" w:type="dxa"/>
-              <w:right w:w="150" w:type="dxa"/>
-            </w:tcMar>
-            <w:vAlign w:val="center"/>
-            <w:hideMark/>
-          </w:tcPr>
-          <w:p>
-            <w:r/>
-            <w:r>
-              <w:rPr>
-                <w:sz w:val="20"/>
-              </w:rPr>
-              <w:t>合规</w:t>
-            </w:r>
-          </w:p>
-        </w:tc>
-        <w:tc>
-          <w:tcPr>
-            <w:tcW w:w="0" w:type="auto"/>
-            <w:tcMar>
-              <w:top w:w="75" w:type="dxa"/>
-              <w:left w:w="150" w:type="dxa"/>
-              <w:bottom w:w="75" w:type="dxa"/>
-              <w:right w:w="150" w:type="dxa"/>
-            </w:tcMar>
-            <w:vAlign w:val="center"/>
-            <w:hideMark/>
-          </w:tcPr>
-          <w:p>
-            <w:r/>
-            <w:r>
-              <w:rPr>
-                <w:sz w:val="20"/>
-              </w:rPr>
-              <w:t>模块化设计，职责分离</w:t>
+                <w:rFonts w:ascii="Microsoft YaHei" w:hAnsi="Microsoft YaHei"/>
+                <w:sz w:val="18"/>
+              </w:rPr>
+              <w:t>config.py / data.py</w:t>
+            </w:r>
+          </w:p>
+        </w:tc>
+        <w:tc>
+          <w:tcPr>
+            <w:tcW w:w="0" w:type="auto"/>
+            <w:tcMar>
+              <w:top w:w="75" w:type="dxa"/>
+              <w:left w:w="150" w:type="dxa"/>
+              <w:bottom w:w="75" w:type="dxa"/>
+              <w:right w:w="150" w:type="dxa"/>
+            </w:tcMar>
+            <w:vAlign w:val="center"/>
+            <w:hideMark/>
+          </w:tcPr>
+          <w:p>
+            <w:r/>
+            <w:r>
+              <w:rPr>
+                <w:rFonts w:ascii="Microsoft YaHei" w:hAnsi="Microsoft YaHei"/>
+                <w:sz w:val="18"/>
+              </w:rPr>
+              <w:t>原AI加入额外因子以提升表现，属于与题目不一致的冗余逻辑。</w:t>
+            </w:r>
+          </w:p>
+        </w:tc>
+        <w:tc>
+          <w:tcPr>
+            <w:tcW w:w="0" w:type="auto"/>
+            <w:tcMar>
+              <w:top w:w="75" w:type="dxa"/>
+              <w:left w:w="150" w:type="dxa"/>
+              <w:bottom w:w="75" w:type="dxa"/>
+              <w:right w:w="150" w:type="dxa"/>
+            </w:tcMar>
+            <w:vAlign w:val="center"/>
+            <w:hideMark/>
+          </w:tcPr>
+          <w:p>
+            <w:r/>
+            <w:r>
+              <w:rPr>
+                <w:rFonts w:ascii="Microsoft YaHei" w:hAnsi="Microsoft YaHei"/>
+                <w:sz w:val="18"/>
+              </w:rPr>
+              <w:t>P1</w:t>
+            </w:r>
+          </w:p>
+        </w:tc>
+        <w:tc>
+          <w:tcPr>
+            <w:tcW w:w="0" w:type="auto"/>
+            <w:tcMar>
+              <w:top w:w="75" w:type="dxa"/>
+              <w:left w:w="150" w:type="dxa"/>
+              <w:bottom w:w="75" w:type="dxa"/>
+              <w:right w:w="150" w:type="dxa"/>
+            </w:tcMar>
+            <w:vAlign w:val="center"/>
+            <w:hideMark/>
+          </w:tcPr>
+          <w:p>
+            <w:r/>
+            <w:r>
+              <w:rPr>
+                <w:rFonts w:ascii="Microsoft YaHei" w:hAnsi="Microsoft YaHei"/>
+                <w:sz w:val="18"/>
+              </w:rPr>
+              <w:t>已修复</w:t>
+            </w:r>
+          </w:p>
+        </w:tc>
+        <w:tc>
+          <w:tcPr>
+            <w:tcW w:w="0" w:type="auto"/>
+            <w:tcMar>
+              <w:top w:w="75" w:type="dxa"/>
+              <w:left w:w="150" w:type="dxa"/>
+              <w:bottom w:w="75" w:type="dxa"/>
+              <w:right w:w="150" w:type="dxa"/>
+            </w:tcMar>
+            <w:vAlign w:val="center"/>
+            <w:hideMark/>
+          </w:tcPr>
+          <w:p>
+            <w:r/>
+            <w:r>
+              <w:rPr>
+                <w:rFonts w:ascii="Microsoft YaHei" w:hAnsi="Microsoft YaHei"/>
+                <w:sz w:val="18"/>
+              </w:rPr>
+              <w:t>删除扩展因子计算和展示，输出数据表也无扩展因子列。</w:t>
             </w:r>
           </w:p>
         </w:tc>
@@ -7572,7 +7679,8 @@
             <w:r/>
             <w:r>
               <w:rPr>
-                <w:sz w:val="20"/>
+                <w:rFonts w:ascii="Microsoft YaHei" w:hAnsi="Microsoft YaHei"/>
+                <w:sz w:val="18"/>
               </w:rPr>
               <w:t>全局</w:t>
             </w:r>
@@ -7594,29 +7702,31 @@
             <w:r/>
             <w:r>
               <w:rPr>
-                <w:sz w:val="20"/>
-              </w:rPr>
-              <w:t>核心逻辑、因子计算、交易规则均有清晰中文注释</w:t>
-            </w:r>
-          </w:p>
-        </w:tc>
-        <w:tc>
-          <w:tcPr>
-            <w:tcW w:w="0" w:type="auto"/>
-            <w:tcMar>
-              <w:top w:w="75" w:type="dxa"/>
-              <w:left w:w="150" w:type="dxa"/>
-              <w:bottom w:w="75" w:type="dxa"/>
-              <w:right w:w="150" w:type="dxa"/>
-            </w:tcMar>
-            <w:vAlign w:val="center"/>
-            <w:hideMark/>
-          </w:tcPr>
-          <w:p>
-            <w:r/>
-            <w:r>
-              <w:rPr>
-                <w:sz w:val="20"/>
+                <w:rFonts w:ascii="Microsoft YaHei" w:hAnsi="Microsoft YaHei"/>
+                <w:sz w:val="18"/>
+              </w:rPr>
+              <w:t>核心模块有函数划分和中文说明。</w:t>
+            </w:r>
+          </w:p>
+        </w:tc>
+        <w:tc>
+          <w:tcPr>
+            <w:tcW w:w="0" w:type="auto"/>
+            <w:tcMar>
+              <w:top w:w="75" w:type="dxa"/>
+              <w:left w:w="150" w:type="dxa"/>
+              <w:bottom w:w="75" w:type="dxa"/>
+              <w:right w:w="150" w:type="dxa"/>
+            </w:tcMar>
+            <w:vAlign w:val="center"/>
+            <w:hideMark/>
+          </w:tcPr>
+          <w:p>
+            <w:r/>
+            <w:r>
+              <w:rPr>
+                <w:rFonts w:ascii="Microsoft YaHei" w:hAnsi="Microsoft YaHei"/>
+                <w:sz w:val="18"/>
               </w:rPr>
               <w:t>无</w:t>
             </w:r>
@@ -7638,7 +7748,8 @@
             <w:r/>
             <w:r>
               <w:rPr>
-                <w:sz w:val="20"/>
+                <w:rFonts w:ascii="Microsoft YaHei" w:hAnsi="Microsoft YaHei"/>
+                <w:sz w:val="18"/>
               </w:rPr>
               <w:t>合规</w:t>
             </w:r>
@@ -7660,9 +7771,10 @@
             <w:r/>
             <w:r>
               <w:rPr>
-                <w:sz w:val="20"/>
-              </w:rPr>
-              <w:t>每个模块和函数均有docstring</w:t>
+                <w:rFonts w:ascii="Microsoft YaHei" w:hAnsi="Microsoft YaHei"/>
+                <w:sz w:val="18"/>
+              </w:rPr>
+              <w:t>保留模块化结构：data、factors、models、backtest、plots、main。</w:t>
             </w:r>
           </w:p>
         </w:tc>
@@ -7792,7 +7904,8 @@
             <w:r/>
             <w:r>
               <w:rPr>
-                <w:sz w:val="20"/>
+                <w:rFonts w:ascii="Microsoft YaHei" w:hAnsi="Microsoft YaHei"/>
+                <w:sz w:val="18"/>
               </w:rPr>
               <w:t>全局</w:t>
             </w:r>
@@ -7814,29 +7927,31 @@
             <w:r/>
             <w:r>
               <w:rPr>
-                <w:sz w:val="20"/>
-              </w:rPr>
-              <w:t>变量、函数命名符合Python规范，见名知意</w:t>
-            </w:r>
-          </w:p>
-        </w:tc>
-        <w:tc>
-          <w:tcPr>
-            <w:tcW w:w="0" w:type="auto"/>
-            <w:tcMar>
-              <w:top w:w="75" w:type="dxa"/>
-              <w:left w:w="150" w:type="dxa"/>
-              <w:bottom w:w="75" w:type="dxa"/>
-              <w:right w:w="150" w:type="dxa"/>
-            </w:tcMar>
-            <w:vAlign w:val="center"/>
-            <w:hideMark/>
-          </w:tcPr>
-          <w:p>
-            <w:r/>
-            <w:r>
-              <w:rPr>
-                <w:sz w:val="20"/>
+                <w:rFonts w:ascii="Microsoft YaHei" w:hAnsi="Microsoft YaHei"/>
+                <w:sz w:val="18"/>
+              </w:rPr>
+              <w:t>变量和函数命名整体符合Python规范。</w:t>
+            </w:r>
+          </w:p>
+        </w:tc>
+        <w:tc>
+          <w:tcPr>
+            <w:tcW w:w="0" w:type="auto"/>
+            <w:tcMar>
+              <w:top w:w="75" w:type="dxa"/>
+              <w:left w:w="150" w:type="dxa"/>
+              <w:bottom w:w="75" w:type="dxa"/>
+              <w:right w:w="150" w:type="dxa"/>
+            </w:tcMar>
+            <w:vAlign w:val="center"/>
+            <w:hideMark/>
+          </w:tcPr>
+          <w:p>
+            <w:r/>
+            <w:r>
+              <w:rPr>
+                <w:rFonts w:ascii="Microsoft YaHei" w:hAnsi="Microsoft YaHei"/>
+                <w:sz w:val="18"/>
               </w:rPr>
               <w:t>无</w:t>
             </w:r>
@@ -7858,7 +7973,8 @@
             <w:r/>
             <w:r>
               <w:rPr>
-                <w:sz w:val="20"/>
+                <w:rFonts w:ascii="Microsoft YaHei" w:hAnsi="Microsoft YaHei"/>
+                <w:sz w:val="18"/>
               </w:rPr>
               <w:t>合规</w:t>
             </w:r>
@@ -7880,9 +7996,10 @@
             <w:r/>
             <w:r>
               <w:rPr>
-                <w:sz w:val="20"/>
-              </w:rPr>
-              <w:t>使用snake_case命名</w:t>
+                <w:rFonts w:ascii="Microsoft YaHei" w:hAnsi="Microsoft YaHei"/>
+                <w:sz w:val="18"/>
+              </w:rPr>
+              <w:t>使用snake_case命名，关键参数集中在config.py。</w:t>
             </w:r>
           </w:p>
         </w:tc>
@@ -8086,7 +8203,8 @@
             <w:r/>
             <w:r>
               <w:rPr>
-                <w:sz w:val="20"/>
+                <w:rFonts w:ascii="Microsoft YaHei" w:hAnsi="Microsoft YaHei"/>
+                <w:sz w:val="18"/>
               </w:rPr>
               <w:t>全局</w:t>
             </w:r>
@@ -8108,29 +8226,31 @@
             <w:r/>
             <w:r>
               <w:rPr>
-                <w:sz w:val="20"/>
-              </w:rPr>
-              <w:t>按数据→因子→质检→模型→回测→绘图模块化拆分</w:t>
-            </w:r>
-          </w:p>
-        </w:tc>
-        <w:tc>
-          <w:tcPr>
-            <w:tcW w:w="0" w:type="auto"/>
-            <w:tcMar>
-              <w:top w:w="75" w:type="dxa"/>
-              <w:left w:w="150" w:type="dxa"/>
-              <w:bottom w:w="75" w:type="dxa"/>
-              <w:right w:w="150" w:type="dxa"/>
-            </w:tcMar>
-            <w:vAlign w:val="center"/>
-            <w:hideMark/>
-          </w:tcPr>
-          <w:p>
-            <w:r/>
-            <w:r>
-              <w:rPr>
-                <w:sz w:val="20"/>
+                <w:rFonts w:ascii="Microsoft YaHei" w:hAnsi="Microsoft YaHei"/>
+                <w:sz w:val="18"/>
+              </w:rPr>
+              <w:t>流程结构与作业模块一致。</w:t>
+            </w:r>
+          </w:p>
+        </w:tc>
+        <w:tc>
+          <w:tcPr>
+            <w:tcW w:w="0" w:type="auto"/>
+            <w:tcMar>
+              <w:top w:w="75" w:type="dxa"/>
+              <w:left w:w="150" w:type="dxa"/>
+              <w:bottom w:w="75" w:type="dxa"/>
+              <w:right w:w="150" w:type="dxa"/>
+            </w:tcMar>
+            <w:vAlign w:val="center"/>
+            <w:hideMark/>
+          </w:tcPr>
+          <w:p>
+            <w:r/>
+            <w:r>
+              <w:rPr>
+                <w:rFonts w:ascii="Microsoft YaHei" w:hAnsi="Microsoft YaHei"/>
+                <w:sz w:val="18"/>
               </w:rPr>
               <w:t>无</w:t>
             </w:r>
@@ -8152,7 +8272,8 @@
             <w:r/>
             <w:r>
               <w:rPr>
-                <w:sz w:val="20"/>
+                <w:rFonts w:ascii="Microsoft YaHei" w:hAnsi="Microsoft YaHei"/>
+                <w:sz w:val="18"/>
               </w:rPr>
               <w:t>合规</w:t>
             </w:r>
@@ -8174,9 +8295,10 @@
             <w:r/>
             <w:r>
               <w:rPr>
-                <w:sz w:val="20"/>
-              </w:rPr>
-              <w:t>7个独立模块+main.py入口</w:t>
+                <w:rFonts w:ascii="Microsoft YaHei" w:hAnsi="Microsoft YaHei"/>
+                <w:sz w:val="18"/>
+              </w:rPr>
+              <w:t>本地数据加载→因子计算→质检→LGBM→样本外回测→图表/PPT。</w:t>
             </w:r>
           </w:p>
         </w:tc>
@@ -8322,51 +8444,54 @@
             <w:r/>
             <w:r>
               <w:rPr>
-                <w:sz w:val="20"/>
-              </w:rPr>
-              <w:t>data.py, factors.py</w:t>
-            </w:r>
-          </w:p>
-        </w:tc>
-        <w:tc>
-          <w:tcPr>
-            <w:tcW w:w="0" w:type="auto"/>
-            <w:tcMar>
-              <w:top w:w="75" w:type="dxa"/>
-              <w:left w:w="150" w:type="dxa"/>
-              <w:bottom w:w="75" w:type="dxa"/>
-              <w:right w:w="150" w:type="dxa"/>
-            </w:tcMar>
-            <w:vAlign w:val="center"/>
-            <w:hideMark/>
-          </w:tcPr>
-          <w:p>
-            <w:r/>
-            <w:r>
-              <w:rPr>
-                <w:sz w:val="20"/>
-              </w:rPr>
-              <w:t>try-except捕获异常，NaN检查</w:t>
-            </w:r>
-          </w:p>
-        </w:tc>
-        <w:tc>
-          <w:tcPr>
-            <w:tcW w:w="0" w:type="auto"/>
-            <w:tcMar>
-              <w:top w:w="75" w:type="dxa"/>
-              <w:left w:w="150" w:type="dxa"/>
-              <w:bottom w:w="75" w:type="dxa"/>
-              <w:right w:w="150" w:type="dxa"/>
-            </w:tcMar>
-            <w:vAlign w:val="center"/>
-            <w:hideMark/>
-          </w:tcPr>
-          <w:p>
-            <w:r/>
-            <w:r>
-              <w:rPr>
-                <w:sz w:val="20"/>
+                <w:rFonts w:ascii="Microsoft YaHei" w:hAnsi="Microsoft YaHei"/>
+                <w:sz w:val="18"/>
+              </w:rPr>
+              <w:t>data.py / factors.py</w:t>
+            </w:r>
+          </w:p>
+        </w:tc>
+        <w:tc>
+          <w:tcPr>
+            <w:tcW w:w="0" w:type="auto"/>
+            <w:tcMar>
+              <w:top w:w="75" w:type="dxa"/>
+              <w:left w:w="150" w:type="dxa"/>
+              <w:bottom w:w="75" w:type="dxa"/>
+              <w:right w:w="150" w:type="dxa"/>
+            </w:tcMar>
+            <w:vAlign w:val="center"/>
+            <w:hideMark/>
+          </w:tcPr>
+          <w:p>
+            <w:r/>
+            <w:r>
+              <w:rPr>
+                <w:rFonts w:ascii="Microsoft YaHei" w:hAnsi="Microsoft YaHei"/>
+                <w:sz w:val="18"/>
+              </w:rPr>
+              <w:t>部分函数仍以数据清洗和NaN过滤为主，异常捕获不算完整。</w:t>
+            </w:r>
+          </w:p>
+        </w:tc>
+        <w:tc>
+          <w:tcPr>
+            <w:tcW w:w="0" w:type="auto"/>
+            <w:tcMar>
+              <w:top w:w="75" w:type="dxa"/>
+              <w:left w:w="150" w:type="dxa"/>
+              <w:bottom w:w="75" w:type="dxa"/>
+              <w:right w:w="150" w:type="dxa"/>
+            </w:tcMar>
+            <w:vAlign w:val="center"/>
+            <w:hideMark/>
+          </w:tcPr>
+          <w:p>
+            <w:r/>
+            <w:r>
+              <w:rPr>
+                <w:rFonts w:ascii="Microsoft YaHei" w:hAnsi="Microsoft YaHei"/>
+                <w:sz w:val="18"/>
               </w:rPr>
               <w:t>P2</w:t>
             </w:r>
@@ -8388,7 +8513,8 @@
             <w:r/>
             <w:r>
               <w:rPr>
-                <w:sz w:val="20"/>
+                <w:rFonts w:ascii="Microsoft YaHei" w:hAnsi="Microsoft YaHei"/>
+                <w:sz w:val="18"/>
               </w:rPr>
               <w:t>部分修复</w:t>
             </w:r>
@@ -8410,9 +8536,10 @@
             <w:r/>
             <w:r>
               <w:rPr>
-                <w:sz w:val="20"/>
-              </w:rPr>
-              <w:t>部分函数缺少完整的错误处理</w:t>
+                <w:rFonts w:ascii="Microsoft YaHei" w:hAnsi="Microsoft YaHei"/>
+                <w:sz w:val="18"/>
+              </w:rPr>
+              <w:t>当前已能稳定重跑；后续可增加更细的文件缺失和字段缺失错误提示。</w:t>
             </w:r>
           </w:p>
         </w:tc>
@@ -8560,51 +8687,54 @@
             <w:r/>
             <w:r>
               <w:rPr>
-                <w:sz w:val="20"/>
-              </w:rPr>
-              <w:t>config.py:LGBM_PARAMS, line 65</w:t>
-            </w:r>
-          </w:p>
-        </w:tc>
-        <w:tc>
-          <w:tcPr>
-            <w:tcW w:w="0" w:type="auto"/>
-            <w:tcMar>
-              <w:top w:w="75" w:type="dxa"/>
-              <w:left w:w="150" w:type="dxa"/>
-              <w:bottom w:w="75" w:type="dxa"/>
-              <w:right w:w="150" w:type="dxa"/>
-            </w:tcMar>
-            <w:vAlign w:val="center"/>
-            <w:hideMark/>
-          </w:tcPr>
-          <w:p>
-            <w:r/>
-            <w:r>
-              <w:rPr>
-                <w:sz w:val="20"/>
-              </w:rPr>
-              <w:t>固定随机种子seed=42</w:t>
-            </w:r>
-          </w:p>
-        </w:tc>
-        <w:tc>
-          <w:tcPr>
-            <w:tcW w:w="0" w:type="auto"/>
-            <w:tcMar>
-              <w:top w:w="75" w:type="dxa"/>
-              <w:left w:w="150" w:type="dxa"/>
-              <w:bottom w:w="75" w:type="dxa"/>
-              <w:right w:w="150" w:type="dxa"/>
-            </w:tcMar>
-            <w:vAlign w:val="center"/>
-            <w:hideMark/>
-          </w:tcPr>
-          <w:p>
-            <w:r/>
-            <w:r>
-              <w:rPr>
-                <w:sz w:val="20"/>
+                <w:rFonts w:ascii="Microsoft YaHei" w:hAnsi="Microsoft YaHei"/>
+                <w:sz w:val="18"/>
+              </w:rPr>
+              <w:t>config.py:LGBM_PARAMS</w:t>
+            </w:r>
+          </w:p>
+        </w:tc>
+        <w:tc>
+          <w:tcPr>
+            <w:tcW w:w="0" w:type="auto"/>
+            <w:tcMar>
+              <w:top w:w="75" w:type="dxa"/>
+              <w:left w:w="150" w:type="dxa"/>
+              <w:bottom w:w="75" w:type="dxa"/>
+              <w:right w:w="150" w:type="dxa"/>
+            </w:tcMar>
+            <w:vAlign w:val="center"/>
+            <w:hideMark/>
+          </w:tcPr>
+          <w:p>
+            <w:r/>
+            <w:r>
+              <w:rPr>
+                <w:rFonts w:ascii="Microsoft YaHei" w:hAnsi="Microsoft YaHei"/>
+                <w:sz w:val="18"/>
+              </w:rPr>
+              <w:t>结果需要可复现。</w:t>
+            </w:r>
+          </w:p>
+        </w:tc>
+        <w:tc>
+          <w:tcPr>
+            <w:tcW w:w="0" w:type="auto"/>
+            <w:tcMar>
+              <w:top w:w="75" w:type="dxa"/>
+              <w:left w:w="150" w:type="dxa"/>
+              <w:bottom w:w="75" w:type="dxa"/>
+              <w:right w:w="150" w:type="dxa"/>
+            </w:tcMar>
+            <w:vAlign w:val="center"/>
+            <w:hideMark/>
+          </w:tcPr>
+          <w:p>
+            <w:r/>
+            <w:r>
+              <w:rPr>
+                <w:rFonts w:ascii="Microsoft YaHei" w:hAnsi="Microsoft YaHei"/>
+                <w:sz w:val="18"/>
               </w:rPr>
               <w:t>无</w:t>
             </w:r>
@@ -8626,7 +8756,8 @@
             <w:r/>
             <w:r>
               <w:rPr>
-                <w:sz w:val="20"/>
+                <w:rFonts w:ascii="Microsoft YaHei" w:hAnsi="Microsoft YaHei"/>
+                <w:sz w:val="18"/>
               </w:rPr>
               <w:t>合规</w:t>
             </w:r>
@@ -8648,9 +8779,10 @@
             <w:r/>
             <w:r>
               <w:rPr>
-                <w:sz w:val="20"/>
-              </w:rPr>
-              <w:t>LGBM参数中设置seed=42</w:t>
+                <w:rFonts w:ascii="Microsoft YaHei" w:hAnsi="Microsoft YaHei"/>
+                <w:sz w:val="18"/>
+              </w:rPr>
+              <w:t>LightGBM设置seed=42，重跑结果可复现。</w:t>
             </w:r>
           </w:p>
         </w:tc>
@@ -8917,13 +9049,14 @@
             <w:r/>
             <w:r>
               <w:rPr>
-                <w:sz w:val="20"/>
-              </w:rPr>
-              <w:t>1. 无显式止损机制：回测依赖模型自动选股，未设置单笔止损和账户总回撤控制</w:t>
+                <w:rFonts w:ascii="Microsoft YaHei" w:hAnsi="Microsoft YaHei"/>
+                <w:sz w:val="18"/>
+              </w:rPr>
+              <w:t>1. 因子口径偏离作业要求：原AI加入4个扩展因子，已改回4因子。</w:t>
               <w:br/>
-              <w:t>2. 总仓位100%满仓：未设置80%仓位上限，极端行情下风险敞口过大</w:t>
+              <w:t>2. 样本外信息污染：原IC/OLS使用full_df、缩尾使用全样本阈值，已改为训练集质检和按日截面缩尾。</w:t>
               <w:br/>
-              <w:t>3. 错误处理不完善：部分函数缺少完整的try-except和日志记录</w:t>
+              <w:t>3. 回测细节偏差：首日成本、末日调仓、基准起点已修复。</w:t>
             </w:r>
           </w:p>
         </w:tc>
@@ -8980,13 +9113,14 @@
             <w:r/>
             <w:r>
               <w:rPr>
-                <w:sz w:val="20"/>
-              </w:rPr>
-              <w:t>1. MoneyFlow因子修复：添加5日滚动净流入计算，符合作业要求的定义</w:t>
+                <w:rFonts w:ascii="Microsoft YaHei" w:hAnsi="Microsoft YaHei"/>
+                <w:sz w:val="18"/>
+              </w:rPr>
+              <w:t>1. 统一4因子口径并重跑全部数据。</w:t>
               <w:br/>
-              <w:t>2. 回测逻辑修复：修正了持仓收益计算的时间对齐bug，确保无未来函数</w:t>
+              <w:t>2. 修正训练/回测隔离，样本外只用于2024-2025打分与回测。</w:t>
               <w:br/>
-              <w:t>3. 扩展因子添加：增加Momentum/Volatility/Turnover/VolumeChange四个因子增强模型能力</w:t>
+              <w:t>3. 重做PPT，直接读取最新结果，避免旧版硬编码。</w:t>
             </w:r>
           </w:p>
         </w:tc>
@@ -9064,11 +9198,14 @@
             <w:r/>
             <w:r>
               <w:rPr>
-                <w:sz w:val="20"/>
+                <w:rFonts w:ascii="Microsoft YaHei" w:hAnsi="Microsoft YaHei"/>
+                <w:sz w:val="18"/>
               </w:rPr>
               <w:t>□ 完全合规（所有P0/P1问题已修复）</w:t>
               <w:br/>
-              <w:t>☑ 基本合规（仅剩余低优先级优化问题）</w:t>
+              <w:t>☑ 基本合规（P0/P1已修复，仅剩止损和仓位上限等P2实盘优化项）</w:t>
+              <w:br/>
+              <w:t>□ 不合规（存在未修复的致命缺陷）</w:t>
             </w:r>
           </w:p>
         </w:tc>
@@ -9143,15 +9280,10 @@
             <w:r/>
             <w:r>
               <w:rPr>
-                <w:sz w:val="20"/>
-              </w:rPr>
-              <w:t>1. AI擅长快速实现标准化流程（数据加载、因子计算、模型训练），但因子经济逻辑仍需人工判断</w:t>
-              <w:br/>
-              <w:t>2. 回测代码的时间对齐和未来函数检查需要人工仔细审核，AI容易产生微妙的时序错误</w:t>
-              <w:br/>
-              <w:t>3. 模型可解释性不足，LGBM特征重要性仅反映统计关系，非因果关系</w:t>
-              <w:br/>
-              <w:t>4. AI生成的代码可能包含逻辑矛盾（如同时买入和卖出），需要逐行审查</w:t>
+                <w:rFonts w:ascii="Microsoft YaHei" w:hAnsi="Microsoft YaHei"/>
+                <w:sz w:val="18"/>
+              </w:rPr>
+              <w:t>AI适合快速生成量化流程框架，但会倾向于添加额外因子或复用全样本结果来提高表现。本次人工审查重点修复了题目口径、样本隔离、交易成本和展示材料一致性。量化作业不能只看收益高低，必须确认每个数字都来自正确数据区间和正确交易假设。</w:t>
             </w:r>
           </w:p>
         </w:tc>

</xml_diff>